<commit_message>
modify user prompt in skool according to report structure
</commit_message>
<xml_diff>
--- a/skool_crawl/summary_doubao.docx
+++ b/skool_crawl/summary_doubao.docx
@@ -27,7 +27,7 @@
           <w:rStyle w:val="VerbatimChar"/>
           <w:rFonts w:hint="eastAsia"/>
         </w:rPr>
-        <w:t xml:space="preserve">生成时间：2025-10-29T08:13:11.491859+00:00</w:t>
+        <w:t xml:space="preserve">生成时间：2025-11-17T06:56:23.118552+00:00</w:t>
       </w:r>
       <w:r>
         <w:br/>
@@ -67,7 +67,26 @@
         <w:rPr>
           <w:rStyle w:val="VerbatimChar"/>
         </w:rPr>
-        <w:t xml:space="preserve">&lt;SUMMARY&gt;</w:t>
+        <w:t xml:space="preserve"># AI </w:t>
+      </w:r>
+      <w:r>
+        <w:rPr>
+          <w:rStyle w:val="VerbatimChar"/>
+          <w:rFonts w:hint="eastAsia"/>
+        </w:rPr>
+        <w:t xml:space="preserve">自动化与创业相关讨论报告</w:t>
+      </w:r>
+    </w:p>
+    <w:bookmarkStart w:id="9" w:name="一引言"/>
+    <w:p>
+      <w:pPr>
+        <w:pStyle w:val="Heading2"/>
+      </w:pPr>
+      <w:r>
+        <w:rPr>
+          <w:rFonts w:hint="eastAsia"/>
+        </w:rPr>
+        <w:t xml:space="preserve">一、引言</w:t>
       </w:r>
     </w:p>
     <w:p>
@@ -78,126 +97,1219 @@
         <w:rPr>
           <w:rFonts w:hint="eastAsia"/>
         </w:rPr>
-        <w:t xml:space="preserve">这些帖子主要讨论了三个方面的内容。首先，一位对AI自动化感兴趣且正在学习Nate课程的用户，向有经验的自动化从业者寻求建议，涉及制作好的工作流如何卖给客户、AI基础设施与AI自动化的区别，以及通过提示构建工作流的新工具是否会让客户自行构建工作流等问题。其次，有人在为AI自动化套件的业务报价结构征求意见，给出了两种不同的免费试用方案并分析了各自的优缺点。最后，有一位视频编辑人员发布信息，表示可承接视频编辑工作。</w:t>
+        <w:t xml:space="preserve">本报告基于</w:t>
+      </w:r>
+      <w:r>
+        <w:t xml:space="preserve"> Skool </w:t>
+      </w:r>
+      <w:r>
+        <w:rPr>
+          <w:rFonts w:hint="eastAsia"/>
+        </w:rPr>
+        <w:t xml:space="preserve">平台上</w:t>
+      </w:r>
+      <w:r>
+        <w:t xml:space="preserve"> AI </w:t>
+      </w:r>
+      <w:r>
+        <w:rPr>
+          <w:rFonts w:hint="eastAsia"/>
+        </w:rPr>
+        <w:t xml:space="preserve">自动化社区的帖子数据，涵盖了创业合作、AI</w:t>
+      </w:r>
+      <w:r>
+        <w:t xml:space="preserve"> </w:t>
+      </w:r>
+      <w:r>
+        <w:rPr>
+          <w:rFonts w:hint="eastAsia"/>
+        </w:rPr>
+        <w:t xml:space="preserve">应用开发、销售策略、技术连接等多个方面的内容。通过对这些帖子的分析，旨在全面了解当前</w:t>
+      </w:r>
+      <w:r>
+        <w:t xml:space="preserve"> AI </w:t>
+      </w:r>
+      <w:r>
+        <w:rPr>
+          <w:rFonts w:hint="eastAsia"/>
+        </w:rPr>
+        <w:t xml:space="preserve">自动化领域的热点话题、发展趋势以及社区成员面临的问题与挑战。</w:t>
+      </w:r>
+    </w:p>
+    <w:bookmarkEnd w:id="9"/>
+    <w:bookmarkStart w:id="11" w:name="二主题提炼"/>
+    <w:p>
+      <w:pPr>
+        <w:pStyle w:val="Heading2"/>
+      </w:pPr>
+      <w:r>
+        <w:rPr>
+          <w:rFonts w:hint="eastAsia"/>
+        </w:rPr>
+        <w:t xml:space="preserve">二、主题提炼</w:t>
+      </w:r>
+    </w:p>
+    <w:bookmarkStart w:id="10" w:name="一创业合作"/>
+    <w:p>
+      <w:pPr>
+        <w:pStyle w:val="Heading3"/>
+      </w:pPr>
+      <w:r>
+        <w:rPr>
+          <w:rFonts w:hint="eastAsia"/>
+        </w:rPr>
+        <w:t xml:space="preserve">（一）创业合作</w:t>
       </w:r>
     </w:p>
     <w:p>
       <w:pPr>
-        <w:pStyle w:val="BodyText"/>
-      </w:pPr>
-      <w:r>
-        <w:t xml:space="preserve"> </w:t>
-      </w:r>
-      <w:r>
-        <w:t xml:space="preserve">- </w:t>
-      </w:r>
-      <w:r>
-        <w:rPr>
-          <w:rFonts w:hint="eastAsia"/>
-        </w:rPr>
-        <w:t xml:space="preserve">询问制作好的工作流卖给客户的方式及相关担忧。</w:t>
-      </w:r>
-      <w:r>
-        <w:t xml:space="preserve"> </w:t>
-      </w:r>
-      <w:r>
-        <w:t xml:space="preserve">- </w:t>
-      </w:r>
-      <w:r>
-        <w:rPr>
-          <w:rFonts w:hint="eastAsia"/>
-        </w:rPr>
-        <w:t xml:space="preserve">询问AI基础设施与AI自动化的区别。</w:t>
-      </w:r>
-      <w:r>
-        <w:t xml:space="preserve"> </w:t>
-      </w:r>
-      <w:r>
-        <w:t xml:space="preserve">- </w:t>
-      </w:r>
-      <w:r>
-        <w:rPr>
-          <w:rFonts w:hint="eastAsia"/>
-        </w:rPr>
-        <w:t xml:space="preserve">询问通过提示构建工作流的新工具是否会让客户自行构建工作流。</w:t>
-      </w:r>
-      <w:r>
-        <w:t xml:space="preserve"> </w:t>
-      </w:r>
-      <w:r>
-        <w:t xml:space="preserve">- </w:t>
-      </w:r>
-      <w:r>
-        <w:rPr>
-          <w:rFonts w:hint="eastAsia"/>
-        </w:rPr>
-        <w:t xml:space="preserve">提出AI自动化套件业务报价的两种免费试用方案。</w:t>
-      </w:r>
-      <w:r>
-        <w:t xml:space="preserve"> </w:t>
-      </w:r>
-      <w:r>
-        <w:t xml:space="preserve">- </w:t>
-      </w:r>
-      <w:r>
-        <w:rPr>
-          <w:rFonts w:hint="eastAsia"/>
-        </w:rPr>
-        <w:t xml:space="preserve">指出方案1中聊天机器人有即时吸引力，利于提升知名度和品牌信任。</w:t>
-      </w:r>
-      <w:r>
-        <w:t xml:space="preserve"> </w:t>
-      </w:r>
-      <w:r>
-        <w:t xml:space="preserve">- </w:t>
-      </w:r>
-      <w:r>
-        <w:rPr>
-          <w:rFonts w:hint="eastAsia"/>
-        </w:rPr>
-        <w:t xml:space="preserve">指出方案1中很多企业在看到报价或预订效果前难以意识到货币投资回报率。</w:t>
-      </w:r>
-      <w:r>
-        <w:t xml:space="preserve"> </w:t>
-      </w:r>
-      <w:r>
-        <w:t xml:space="preserve">- </w:t>
-      </w:r>
-      <w:r>
-        <w:rPr>
-          <w:rFonts w:hint="eastAsia"/>
-        </w:rPr>
-        <w:t xml:space="preserve">指出方案2中报价生成器能快速看到可见结果，便于促成转化。</w:t>
-      </w:r>
-      <w:r>
-        <w:t xml:space="preserve"> </w:t>
-      </w:r>
-      <w:r>
-        <w:t xml:space="preserve">- </w:t>
-      </w:r>
-      <w:r>
-        <w:rPr>
-          <w:rFonts w:hint="eastAsia"/>
-        </w:rPr>
-        <w:t xml:space="preserve">有视频编辑人员发布承接工作信息。</w:t>
+        <w:pStyle w:val="FirstParagraph"/>
+      </w:pPr>
+      <w:r>
+        <w:rPr>
+          <w:rFonts w:hint="eastAsia"/>
+        </w:rPr>
+        <w:t xml:space="preserve">包括寻找创业伙伴共同开展</w:t>
+      </w:r>
+      <w:r>
+        <w:t xml:space="preserve"> AI </w:t>
+      </w:r>
+      <w:r>
+        <w:rPr>
+          <w:rFonts w:hint="eastAsia"/>
+        </w:rPr>
+        <w:t xml:space="preserve">相关业务，如组建</w:t>
+      </w:r>
+      <w:r>
+        <w:t xml:space="preserve"> AI </w:t>
+      </w:r>
+      <w:r>
+        <w:rPr>
+          <w:rFonts w:hint="eastAsia"/>
+        </w:rPr>
+        <w:t xml:space="preserve">代理机构、开发</w:t>
+      </w:r>
+      <w:r>
+        <w:t xml:space="preserve"> AI </w:t>
+      </w:r>
+      <w:r>
+        <w:rPr>
+          <w:rFonts w:hint="eastAsia"/>
+        </w:rPr>
+        <w:t xml:space="preserve">微</w:t>
+      </w:r>
+      <w:r>
+        <w:t xml:space="preserve"> SaaS </w:t>
+      </w:r>
+      <w:r>
+        <w:rPr>
+          <w:rFonts w:hint="eastAsia"/>
+        </w:rPr>
+        <w:t xml:space="preserve">产品等。</w:t>
+      </w:r>
+      <w:r>
+        <w:t xml:space="preserve"> </w:t>
+      </w:r>
+      <w:r>
+        <w:t xml:space="preserve">### </w:t>
+      </w:r>
+      <w:r>
+        <w:rPr>
+          <w:rFonts w:hint="eastAsia"/>
+        </w:rPr>
+        <w:t xml:space="preserve">（二）AI</w:t>
+      </w:r>
+      <w:r>
+        <w:t xml:space="preserve"> </w:t>
+      </w:r>
+      <w:r>
+        <w:rPr>
+          <w:rFonts w:hint="eastAsia"/>
+        </w:rPr>
+        <w:t xml:space="preserve">应用开发</w:t>
+      </w:r>
+      <w:r>
+        <w:t xml:space="preserve"> </w:t>
+      </w:r>
+      <w:r>
+        <w:rPr>
+          <w:rFonts w:hint="eastAsia"/>
+        </w:rPr>
+        <w:t xml:space="preserve">涉及各个领域的</w:t>
+      </w:r>
+      <w:r>
+        <w:t xml:space="preserve"> AI </w:t>
+      </w:r>
+      <w:r>
+        <w:rPr>
+          <w:rFonts w:hint="eastAsia"/>
+        </w:rPr>
+        <w:t xml:space="preserve">应用开发项目，如客户体验代理、房地产批发线索生成自动化、客户保留与绩效智能代理等。</w:t>
+      </w:r>
+      <w:r>
+        <w:t xml:space="preserve"> </w:t>
+      </w:r>
+      <w:r>
+        <w:t xml:space="preserve">### </w:t>
+      </w:r>
+      <w:r>
+        <w:rPr>
+          <w:rFonts w:hint="eastAsia"/>
+        </w:rPr>
+        <w:t xml:space="preserve">（三）技术连接与集成</w:t>
+      </w:r>
+      <w:r>
+        <w:t xml:space="preserve"> </w:t>
+      </w:r>
+      <w:r>
+        <w:rPr>
+          <w:rFonts w:hint="eastAsia"/>
+        </w:rPr>
+        <w:t xml:space="preserve">主要讨论如何将不同的技术和平台进行连接与集成，以实现自动化流程，如连接</w:t>
+      </w:r>
+      <w:r>
+        <w:t xml:space="preserve"> Meta Graph API </w:t>
+      </w:r>
+      <w:r>
+        <w:rPr>
+          <w:rFonts w:hint="eastAsia"/>
+        </w:rPr>
+        <w:t xml:space="preserve">与</w:t>
+      </w:r>
+      <w:r>
+        <w:t xml:space="preserve"> </w:t>
+      </w:r>
+      <w:r>
+        <w:rPr>
+          <w:rFonts w:hint="eastAsia"/>
+        </w:rPr>
+        <w:t xml:space="preserve">n8n、连接</w:t>
+      </w:r>
+      <w:r>
+        <w:t xml:space="preserve"> Slack </w:t>
+      </w:r>
+      <w:r>
+        <w:rPr>
+          <w:rFonts w:hint="eastAsia"/>
+        </w:rPr>
+        <w:t xml:space="preserve">与</w:t>
+      </w:r>
+      <w:r>
+        <w:t xml:space="preserve"> n8n </w:t>
+      </w:r>
+      <w:r>
+        <w:rPr>
+          <w:rFonts w:hint="eastAsia"/>
+        </w:rPr>
+        <w:t xml:space="preserve">等。</w:t>
+      </w:r>
+      <w:r>
+        <w:t xml:space="preserve"> </w:t>
+      </w:r>
+      <w:r>
+        <w:t xml:space="preserve">### </w:t>
+      </w:r>
+      <w:r>
+        <w:rPr>
+          <w:rFonts w:hint="eastAsia"/>
+        </w:rPr>
+        <w:t xml:space="preserve">（四）销售策略</w:t>
+      </w:r>
+      <w:r>
+        <w:t xml:space="preserve"> </w:t>
+      </w:r>
+      <w:r>
+        <w:rPr>
+          <w:rFonts w:hint="eastAsia"/>
+        </w:rPr>
+        <w:t xml:space="preserve">探讨向企业主销售</w:t>
+      </w:r>
+      <w:r>
+        <w:t xml:space="preserve"> AI </w:t>
+      </w:r>
+      <w:r>
+        <w:rPr>
+          <w:rFonts w:hint="eastAsia"/>
+        </w:rPr>
+        <w:t xml:space="preserve">产品的有效策略，强调</w:t>
+      </w:r>
+      <w:r>
+        <w:t xml:space="preserve"> B2B </w:t>
+      </w:r>
+      <w:r>
+        <w:rPr>
+          <w:rFonts w:hint="eastAsia"/>
+        </w:rPr>
+        <w:t xml:space="preserve">销售与</w:t>
+      </w:r>
+      <w:r>
+        <w:t xml:space="preserve"> B2C </w:t>
+      </w:r>
+      <w:r>
+        <w:rPr>
+          <w:rFonts w:hint="eastAsia"/>
+        </w:rPr>
+        <w:t xml:space="preserve">销售的差异。</w:t>
+      </w:r>
+      <w:r>
+        <w:t xml:space="preserve"> </w:t>
+      </w:r>
+      <w:r>
+        <w:t xml:space="preserve">### </w:t>
+      </w:r>
+      <w:r>
+        <w:rPr>
+          <w:rFonts w:hint="eastAsia"/>
+        </w:rPr>
+        <w:t xml:space="preserve">（五）学习与成长</w:t>
+      </w:r>
+      <w:r>
+        <w:t xml:space="preserve"> </w:t>
+      </w:r>
+      <w:r>
+        <w:rPr>
+          <w:rFonts w:hint="eastAsia"/>
+        </w:rPr>
+        <w:t xml:space="preserve">有成员分享从传统行业转型到</w:t>
+      </w:r>
+      <w:r>
+        <w:t xml:space="preserve"> AI </w:t>
+      </w:r>
+      <w:r>
+        <w:rPr>
+          <w:rFonts w:hint="eastAsia"/>
+        </w:rPr>
+        <w:t xml:space="preserve">领域的经历，并询问开始盈利所需的时间和学习曲线。</w:t>
+      </w:r>
+    </w:p>
+    <w:bookmarkEnd w:id="10"/>
+    <w:bookmarkEnd w:id="11"/>
+    <w:bookmarkStart w:id="13" w:name="三帖子综述"/>
+    <w:p>
+      <w:pPr>
+        <w:pStyle w:val="Heading2"/>
+      </w:pPr>
+      <w:r>
+        <w:rPr>
+          <w:rFonts w:hint="eastAsia"/>
+        </w:rPr>
+        <w:t xml:space="preserve">三、帖子综述</w:t>
+      </w:r>
+    </w:p>
+    <w:bookmarkStart w:id="12" w:name="一创业合作类"/>
+    <w:p>
+      <w:pPr>
+        <w:pStyle w:val="Heading3"/>
+      </w:pPr>
+      <w:r>
+        <w:rPr>
+          <w:rFonts w:hint="eastAsia"/>
+        </w:rPr>
+        <w:t xml:space="preserve">（一）创业合作类</w:t>
       </w:r>
     </w:p>
     <w:p>
       <w:pPr>
-        <w:pStyle w:val="BodyText"/>
-      </w:pPr>
-      <w:r>
-        <w:t xml:space="preserve"> </w:t>
-      </w:r>
-      <w:r>
-        <w:rPr>
-          <w:rFonts w:hint="eastAsia"/>
-        </w:rPr>
-        <w:t xml:space="preserve">中性。这些帖子主要是在寻求建议、征求意见和发布业务承接信息，未体现出明显的积极或负面情感，只是客观地提出问题和陈述情况。</w:t>
+        <w:pStyle w:val="Compact"/>
+        <w:numPr>
+          <w:ilvl w:val="0"/>
+          <w:numId w:val="1001"/>
+        </w:numPr>
+      </w:pPr>
+      <w:r>
+        <w:rPr>
+          <w:rFonts w:hint="eastAsia"/>
+          <w:b/>
+          <w:bCs/>
+        </w:rPr>
+        <w:t xml:space="preserve">寻找</w:t>
+      </w:r>
+      <w:r>
+        <w:rPr>
+          <w:b/>
+          <w:bCs/>
+        </w:rPr>
+        <w:t xml:space="preserve"> AI </w:t>
+      </w:r>
+      <w:r>
+        <w:rPr>
+          <w:rFonts w:hint="eastAsia"/>
+          <w:b/>
+          <w:bCs/>
+        </w:rPr>
+        <w:t xml:space="preserve">代理机构创业伙伴</w:t>
+      </w:r>
+      <w:r>
+        <w:rPr>
+          <w:rFonts w:hint="eastAsia"/>
+        </w:rPr>
+        <w:t xml:space="preserve">：Joseph</w:t>
+      </w:r>
+      <w:r>
+        <w:t xml:space="preserve"> Mondragon </w:t>
+      </w:r>
+      <w:r>
+        <w:rPr>
+          <w:rFonts w:hint="eastAsia"/>
+        </w:rPr>
+        <w:t xml:space="preserve">寻找能处理</w:t>
+      </w:r>
+      <w:r>
+        <w:t xml:space="preserve"> n8n </w:t>
+      </w:r>
+      <w:r>
+        <w:rPr>
+          <w:rFonts w:hint="eastAsia"/>
+        </w:rPr>
+        <w:t xml:space="preserve">技术和自动化项目的人员加入</w:t>
+      </w:r>
+      <w:r>
+        <w:t xml:space="preserve"> AI </w:t>
+      </w:r>
+      <w:r>
+        <w:rPr>
+          <w:rFonts w:hint="eastAsia"/>
+        </w:rPr>
+        <w:t xml:space="preserve">代理机构创业团队。</w:t>
       </w:r>
     </w:p>
     <w:p>
       <w:pPr>
+        <w:pStyle w:val="Compact"/>
+        <w:numPr>
+          <w:ilvl w:val="0"/>
+          <w:numId w:val="1001"/>
+        </w:numPr>
+      </w:pPr>
+      <w:r>
+        <w:rPr>
+          <w:rFonts w:hint="eastAsia"/>
+          <w:b/>
+          <w:bCs/>
+        </w:rPr>
+        <w:t xml:space="preserve">寻找</w:t>
+      </w:r>
+      <w:r>
+        <w:rPr>
+          <w:b/>
+          <w:bCs/>
+        </w:rPr>
+        <w:t xml:space="preserve"> AI </w:t>
+      </w:r>
+      <w:r>
+        <w:rPr>
+          <w:rFonts w:hint="eastAsia"/>
+          <w:b/>
+          <w:bCs/>
+        </w:rPr>
+        <w:t xml:space="preserve">代理和工作流经验伙伴</w:t>
+      </w:r>
+      <w:r>
+        <w:rPr>
+          <w:rFonts w:hint="eastAsia"/>
+        </w:rPr>
+        <w:t xml:space="preserve">：Carson</w:t>
+      </w:r>
+      <w:r>
+        <w:t xml:space="preserve"> Kim </w:t>
+      </w:r>
+      <w:r>
+        <w:rPr>
+          <w:rFonts w:hint="eastAsia"/>
+        </w:rPr>
+        <w:t xml:space="preserve">希望与有构建</w:t>
+      </w:r>
+      <w:r>
+        <w:t xml:space="preserve"> AI </w:t>
+      </w:r>
+      <w:r>
+        <w:rPr>
+          <w:rFonts w:hint="eastAsia"/>
+        </w:rPr>
+        <w:t xml:space="preserve">代理和工作流经验的人合作，共同打造高利润的</w:t>
+      </w:r>
+      <w:r>
+        <w:t xml:space="preserve"> AI </w:t>
+      </w:r>
+      <w:r>
+        <w:rPr>
+          <w:rFonts w:hint="eastAsia"/>
+        </w:rPr>
+        <w:t xml:space="preserve">代理机构。</w:t>
+      </w:r>
+      <w:r>
+        <w:t xml:space="preserve"> </w:t>
+      </w:r>
+      <w:r>
+        <w:t xml:space="preserve">### </w:t>
+      </w:r>
+      <w:r>
+        <w:rPr>
+          <w:rFonts w:hint="eastAsia"/>
+        </w:rPr>
+        <w:t xml:space="preserve">（二）AI</w:t>
+      </w:r>
+      <w:r>
+        <w:t xml:space="preserve"> </w:t>
+      </w:r>
+      <w:r>
+        <w:rPr>
+          <w:rFonts w:hint="eastAsia"/>
+        </w:rPr>
+        <w:t xml:space="preserve">应用开发类</w:t>
+      </w:r>
+    </w:p>
+    <w:p>
+      <w:pPr>
+        <w:pStyle w:val="Compact"/>
+        <w:numPr>
+          <w:ilvl w:val="0"/>
+          <w:numId w:val="1001"/>
+        </w:numPr>
+      </w:pPr>
+      <w:r>
+        <w:rPr>
+          <w:b/>
+          <w:bCs/>
+        </w:rPr>
+        <w:t xml:space="preserve">AI </w:t>
+      </w:r>
+      <w:r>
+        <w:rPr>
+          <w:rFonts w:hint="eastAsia"/>
+          <w:b/>
+          <w:bCs/>
+        </w:rPr>
+        <w:t xml:space="preserve">微</w:t>
+      </w:r>
+      <w:r>
+        <w:rPr>
+          <w:b/>
+          <w:bCs/>
+        </w:rPr>
+        <w:t xml:space="preserve"> SaaS </w:t>
+      </w:r>
+      <w:r>
+        <w:rPr>
+          <w:rFonts w:hint="eastAsia"/>
+          <w:b/>
+          <w:bCs/>
+        </w:rPr>
+        <w:t xml:space="preserve">产品</w:t>
+      </w:r>
+      <w:r>
+        <w:rPr>
+          <w:rFonts w:hint="eastAsia"/>
+        </w:rPr>
+        <w:t xml:space="preserve">：Gian</w:t>
+      </w:r>
+      <w:r>
+        <w:t xml:space="preserve"> Gallegos </w:t>
+      </w:r>
+      <w:r>
+        <w:rPr>
+          <w:rFonts w:hint="eastAsia"/>
+        </w:rPr>
+        <w:t xml:space="preserve">为菲律宾单身市场开发了</w:t>
+      </w:r>
+      <w:r>
+        <w:t xml:space="preserve"> AI </w:t>
+      </w:r>
+      <w:r>
+        <w:rPr>
+          <w:rFonts w:hint="eastAsia"/>
+        </w:rPr>
+        <w:t xml:space="preserve">驱动的费用跟踪器</w:t>
+      </w:r>
+      <w:r>
+        <w:t xml:space="preserve"> </w:t>
+      </w:r>
+      <w:r>
+        <w:rPr>
+          <w:rFonts w:hint="eastAsia"/>
+        </w:rPr>
+        <w:t xml:space="preserve">ResiboKo，利用</w:t>
+      </w:r>
+      <w:r>
+        <w:t xml:space="preserve"> Gemini 2.5 </w:t>
+      </w:r>
+      <w:r>
+        <w:rPr>
+          <w:rFonts w:hint="eastAsia"/>
+        </w:rPr>
+        <w:t xml:space="preserve">技术解决单身人士的财务管理问题。</w:t>
+      </w:r>
+    </w:p>
+    <w:p>
+      <w:pPr>
+        <w:pStyle w:val="Compact"/>
+        <w:numPr>
+          <w:ilvl w:val="0"/>
+          <w:numId w:val="1001"/>
+        </w:numPr>
+      </w:pPr>
+      <w:r>
+        <w:rPr>
+          <w:rFonts w:hint="eastAsia"/>
+          <w:b/>
+          <w:bCs/>
+        </w:rPr>
+        <w:t xml:space="preserve">客户体验代理</w:t>
+      </w:r>
+      <w:r>
+        <w:rPr>
+          <w:rFonts w:hint="eastAsia"/>
+        </w:rPr>
+        <w:t xml:space="preserve">：Muhammad</w:t>
+      </w:r>
+      <w:r>
+        <w:t xml:space="preserve"> Arhan </w:t>
+      </w:r>
+      <w:r>
+        <w:rPr>
+          <w:rFonts w:hint="eastAsia"/>
+        </w:rPr>
+        <w:t xml:space="preserve">完成了</w:t>
+      </w:r>
+      <w:r>
+        <w:t xml:space="preserve"> </w:t>
+      </w:r>
+      <w:r>
+        <w:rPr>
+          <w:rFonts w:hint="eastAsia"/>
+        </w:rPr>
+        <w:t xml:space="preserve">95%的</w:t>
+      </w:r>
+      <w:r>
+        <w:t xml:space="preserve"> CX </w:t>
+      </w:r>
+      <w:r>
+        <w:rPr>
+          <w:rFonts w:hint="eastAsia"/>
+        </w:rPr>
+        <w:t xml:space="preserve">代理项目，该代理针对医疗美容领域，可实现聊天、预约管理等功能，并具备个性化响应和跟进自动化能力。</w:t>
+      </w:r>
+    </w:p>
+    <w:p>
+      <w:pPr>
+        <w:pStyle w:val="Compact"/>
+        <w:numPr>
+          <w:ilvl w:val="0"/>
+          <w:numId w:val="1001"/>
+        </w:numPr>
+      </w:pPr>
+      <w:r>
+        <w:rPr>
+          <w:rFonts w:hint="eastAsia"/>
+          <w:b/>
+          <w:bCs/>
+        </w:rPr>
+        <w:t xml:space="preserve">房地产批发线索生成自动化</w:t>
+      </w:r>
+      <w:r>
+        <w:rPr>
+          <w:rFonts w:hint="eastAsia"/>
+        </w:rPr>
+        <w:t xml:space="preserve">：Wisdom</w:t>
+      </w:r>
+      <w:r>
+        <w:t xml:space="preserve"> Akogwu </w:t>
+      </w:r>
+      <w:r>
+        <w:rPr>
+          <w:rFonts w:hint="eastAsia"/>
+        </w:rPr>
+        <w:t xml:space="preserve">分享了在</w:t>
+      </w:r>
+      <w:r>
+        <w:t xml:space="preserve"> Make.com </w:t>
+      </w:r>
+      <w:r>
+        <w:rPr>
+          <w:rFonts w:hint="eastAsia"/>
+        </w:rPr>
+        <w:t xml:space="preserve">上构建的房地产线索生成场景，可自动捕获、验证和跟踪卖家线索，并将其路由到</w:t>
+      </w:r>
+      <w:r>
+        <w:t xml:space="preserve"> CRM。</w:t>
+      </w:r>
+    </w:p>
+    <w:p>
+      <w:pPr>
+        <w:pStyle w:val="Compact"/>
+        <w:numPr>
+          <w:ilvl w:val="0"/>
+          <w:numId w:val="1001"/>
+        </w:numPr>
+      </w:pPr>
+      <w:r>
+        <w:rPr>
+          <w:rFonts w:hint="eastAsia"/>
+          <w:b/>
+          <w:bCs/>
+        </w:rPr>
+        <w:t xml:space="preserve">客户保留与绩效智能代理</w:t>
+      </w:r>
+      <w:r>
+        <w:rPr>
+          <w:rFonts w:hint="eastAsia"/>
+        </w:rPr>
+        <w:t xml:space="preserve">：Muskan</w:t>
+      </w:r>
+      <w:r>
+        <w:t xml:space="preserve"> Ahlawat </w:t>
+      </w:r>
+      <w:r>
+        <w:rPr>
+          <w:rFonts w:hint="eastAsia"/>
+        </w:rPr>
+        <w:t xml:space="preserve">构建了客户保留与绩效智能代理，每周可拉取客户数据和自动化指标，计算保留分数，标记高风险客户，并生成报告发送给客户和团队。</w:t>
+      </w:r>
+      <w:r>
+        <w:t xml:space="preserve"> </w:t>
+      </w:r>
+      <w:r>
+        <w:t xml:space="preserve">### </w:t>
+      </w:r>
+      <w:r>
+        <w:rPr>
+          <w:rFonts w:hint="eastAsia"/>
+        </w:rPr>
+        <w:t xml:space="preserve">（三）技术连接与集成类</w:t>
+      </w:r>
+    </w:p>
+    <w:p>
+      <w:pPr>
+        <w:pStyle w:val="Compact"/>
+        <w:numPr>
+          <w:ilvl w:val="0"/>
+          <w:numId w:val="1001"/>
+        </w:numPr>
+      </w:pPr>
+      <w:r>
+        <w:rPr>
+          <w:rFonts w:hint="eastAsia"/>
+          <w:b/>
+          <w:bCs/>
+        </w:rPr>
+        <w:t xml:space="preserve">连接</w:t>
+      </w:r>
+      <w:r>
+        <w:rPr>
+          <w:b/>
+          <w:bCs/>
+        </w:rPr>
+        <w:t xml:space="preserve"> Meta Graph API </w:t>
+      </w:r>
+      <w:r>
+        <w:rPr>
+          <w:rFonts w:hint="eastAsia"/>
+          <w:b/>
+          <w:bCs/>
+        </w:rPr>
+        <w:t xml:space="preserve">与</w:t>
+      </w:r>
+      <w:r>
+        <w:rPr>
+          <w:b/>
+          <w:bCs/>
+        </w:rPr>
+        <w:t xml:space="preserve"> n8n</w:t>
+      </w:r>
+      <w:r>
+        <w:rPr>
+          <w:rFonts w:hint="eastAsia"/>
+        </w:rPr>
+        <w:t xml:space="preserve">：Mateo</w:t>
+      </w:r>
+      <w:r>
+        <w:t xml:space="preserve"> Combet </w:t>
+      </w:r>
+      <w:r>
+        <w:rPr>
+          <w:rFonts w:hint="eastAsia"/>
+        </w:rPr>
+        <w:t xml:space="preserve">在构建</w:t>
+      </w:r>
+      <w:r>
+        <w:t xml:space="preserve"> n8n </w:t>
+      </w:r>
+      <w:r>
+        <w:rPr>
+          <w:rFonts w:hint="eastAsia"/>
+        </w:rPr>
+        <w:t xml:space="preserve">自动化时遇到连接</w:t>
+      </w:r>
+      <w:r>
+        <w:t xml:space="preserve"> Meta Graph API </w:t>
+      </w:r>
+      <w:r>
+        <w:rPr>
+          <w:rFonts w:hint="eastAsia"/>
+        </w:rPr>
+        <w:t xml:space="preserve">的问题，对令牌流程感到困惑，寻求相关教程和设置指导。</w:t>
+      </w:r>
+    </w:p>
+    <w:p>
+      <w:pPr>
+        <w:pStyle w:val="Compact"/>
+        <w:numPr>
+          <w:ilvl w:val="0"/>
+          <w:numId w:val="1001"/>
+        </w:numPr>
+      </w:pPr>
+      <w:r>
+        <w:rPr>
+          <w:rFonts w:hint="eastAsia"/>
+          <w:b/>
+          <w:bCs/>
+        </w:rPr>
+        <w:t xml:space="preserve">连接</w:t>
+      </w:r>
+      <w:r>
+        <w:rPr>
+          <w:b/>
+          <w:bCs/>
+        </w:rPr>
+        <w:t xml:space="preserve"> Slack </w:t>
+      </w:r>
+      <w:r>
+        <w:rPr>
+          <w:rFonts w:hint="eastAsia"/>
+          <w:b/>
+          <w:bCs/>
+        </w:rPr>
+        <w:t xml:space="preserve">与</w:t>
+      </w:r>
+      <w:r>
+        <w:rPr>
+          <w:b/>
+          <w:bCs/>
+        </w:rPr>
+        <w:t xml:space="preserve"> n8n</w:t>
+      </w:r>
+      <w:r>
+        <w:rPr>
+          <w:rFonts w:hint="eastAsia"/>
+        </w:rPr>
+        <w:t xml:space="preserve">：Folu</w:t>
+      </w:r>
+      <w:r>
+        <w:t xml:space="preserve"> Ilori </w:t>
+      </w:r>
+      <w:r>
+        <w:rPr>
+          <w:rFonts w:hint="eastAsia"/>
+        </w:rPr>
+        <w:t xml:space="preserve">分享了关于如何连接</w:t>
+      </w:r>
+      <w:r>
+        <w:t xml:space="preserve"> Slack </w:t>
+      </w:r>
+      <w:r>
+        <w:rPr>
+          <w:rFonts w:hint="eastAsia"/>
+        </w:rPr>
+        <w:t xml:space="preserve">与</w:t>
+      </w:r>
+      <w:r>
+        <w:t xml:space="preserve"> n8n </w:t>
+      </w:r>
+      <w:r>
+        <w:rPr>
+          <w:rFonts w:hint="eastAsia"/>
+        </w:rPr>
+        <w:t xml:space="preserve">用于</w:t>
+      </w:r>
+      <w:r>
+        <w:t xml:space="preserve"> AI </w:t>
+      </w:r>
+      <w:r>
+        <w:rPr>
+          <w:rFonts w:hint="eastAsia"/>
+        </w:rPr>
+        <w:t xml:space="preserve">代理的视频链接。</w:t>
+      </w:r>
+      <w:r>
+        <w:t xml:space="preserve"> </w:t>
+      </w:r>
+      <w:r>
+        <w:t xml:space="preserve">### </w:t>
+      </w:r>
+      <w:r>
+        <w:rPr>
+          <w:rFonts w:hint="eastAsia"/>
+        </w:rPr>
+        <w:t xml:space="preserve">（四）销售策略类</w:t>
+      </w:r>
+      <w:r>
+        <w:t xml:space="preserve"> </w:t>
+      </w:r>
+      <w:r>
+        <w:t xml:space="preserve">Michael Essien </w:t>
+      </w:r>
+      <w:r>
+        <w:rPr>
+          <w:rFonts w:hint="eastAsia"/>
+        </w:rPr>
+        <w:t xml:space="preserve">指出向企业主销售</w:t>
+      </w:r>
+      <w:r>
+        <w:t xml:space="preserve"> AI </w:t>
+      </w:r>
+      <w:r>
+        <w:rPr>
+          <w:rFonts w:hint="eastAsia"/>
+        </w:rPr>
+        <w:t xml:space="preserve">产品时，B2B</w:t>
+      </w:r>
+      <w:r>
+        <w:t xml:space="preserve"> </w:t>
+      </w:r>
+      <w:r>
+        <w:rPr>
+          <w:rFonts w:hint="eastAsia"/>
+        </w:rPr>
+        <w:t xml:space="preserve">销售不应采用</w:t>
+      </w:r>
+      <w:r>
+        <w:t xml:space="preserve"> B2C </w:t>
+      </w:r>
+      <w:r>
+        <w:rPr>
+          <w:rFonts w:hint="eastAsia"/>
+        </w:rPr>
+        <w:t xml:space="preserve">的情感销售方式，应采用更有效的销售流程。</w:t>
+      </w:r>
+      <w:r>
+        <w:t xml:space="preserve"> </w:t>
+      </w:r>
+      <w:r>
+        <w:t xml:space="preserve">### </w:t>
+      </w:r>
+      <w:r>
+        <w:rPr>
+          <w:rFonts w:hint="eastAsia"/>
+        </w:rPr>
+        <w:t xml:space="preserve">（五）学习与成长类</w:t>
+      </w:r>
+      <w:r>
+        <w:t xml:space="preserve"> </w:t>
+      </w:r>
+      <w:r>
+        <w:t xml:space="preserve">Guarracino Alessandro </w:t>
+      </w:r>
+      <w:r>
+        <w:rPr>
+          <w:rFonts w:hint="eastAsia"/>
+        </w:rPr>
+        <w:t xml:space="preserve">从酒店行业转型到</w:t>
+      </w:r>
+      <w:r>
+        <w:t xml:space="preserve"> AI </w:t>
+      </w:r>
+      <w:r>
+        <w:rPr>
+          <w:rFonts w:hint="eastAsia"/>
+        </w:rPr>
+        <w:t xml:space="preserve">领域，询问开始提供</w:t>
+      </w:r>
+      <w:r>
+        <w:t xml:space="preserve"> AI </w:t>
+      </w:r>
+      <w:r>
+        <w:rPr>
+          <w:rFonts w:hint="eastAsia"/>
+        </w:rPr>
+        <w:t xml:space="preserve">相关服务并实现盈利所需的时间和学习曲线。</w:t>
+      </w:r>
+    </w:p>
+    <w:bookmarkEnd w:id="12"/>
+    <w:bookmarkEnd w:id="13"/>
+    <w:bookmarkStart w:id="15" w:name="四趋势与模式分析"/>
+    <w:p>
+      <w:pPr>
+        <w:pStyle w:val="Heading2"/>
+      </w:pPr>
+      <w:r>
+        <w:rPr>
+          <w:rFonts w:hint="eastAsia"/>
+        </w:rPr>
+        <w:t xml:space="preserve">四、趋势与模式分析</w:t>
+      </w:r>
+    </w:p>
+    <w:bookmarkStart w:id="14" w:name="一创业趋势"/>
+    <w:p>
+      <w:pPr>
+        <w:pStyle w:val="Heading3"/>
+      </w:pPr>
+      <w:r>
+        <w:rPr>
+          <w:rFonts w:hint="eastAsia"/>
+        </w:rPr>
+        <w:t xml:space="preserve">（一）创业趋势</w:t>
+      </w:r>
+    </w:p>
+    <w:p>
+      <w:pPr>
+        <w:pStyle w:val="FirstParagraph"/>
+      </w:pPr>
+      <w:r>
+        <w:t xml:space="preserve">AI </w:t>
+      </w:r>
+      <w:r>
+        <w:rPr>
+          <w:rFonts w:hint="eastAsia"/>
+        </w:rPr>
+        <w:t xml:space="preserve">领域的创业热情高涨，越来越多的人希望通过合作开展</w:t>
+      </w:r>
+      <w:r>
+        <w:t xml:space="preserve"> AI </w:t>
+      </w:r>
+      <w:r>
+        <w:rPr>
+          <w:rFonts w:hint="eastAsia"/>
+        </w:rPr>
+        <w:t xml:space="preserve">相关业务，尤其是</w:t>
+      </w:r>
+      <w:r>
+        <w:t xml:space="preserve"> AI </w:t>
+      </w:r>
+      <w:r>
+        <w:rPr>
+          <w:rFonts w:hint="eastAsia"/>
+        </w:rPr>
+        <w:t xml:space="preserve">代理机构和微</w:t>
+      </w:r>
+      <w:r>
+        <w:t xml:space="preserve"> SaaS </w:t>
+      </w:r>
+      <w:r>
+        <w:rPr>
+          <w:rFonts w:hint="eastAsia"/>
+        </w:rPr>
+        <w:t xml:space="preserve">产品的开发。</w:t>
+      </w:r>
+      <w:r>
+        <w:t xml:space="preserve"> </w:t>
+      </w:r>
+      <w:r>
+        <w:t xml:space="preserve">### </w:t>
+      </w:r>
+      <w:r>
+        <w:rPr>
+          <w:rFonts w:hint="eastAsia"/>
+        </w:rPr>
+        <w:t xml:space="preserve">（二）应用模式</w:t>
+      </w:r>
+      <w:r>
+        <w:t xml:space="preserve"> </w:t>
+      </w:r>
+      <w:r>
+        <w:t xml:space="preserve">AI </w:t>
+      </w:r>
+      <w:r>
+        <w:rPr>
+          <w:rFonts w:hint="eastAsia"/>
+        </w:rPr>
+        <w:t xml:space="preserve">应用逐渐深入各个行业，如医疗美容、房地产、金融等，为解决特定行业的问题提供了创新的解决方案。同时，注重客户体验和数据驱动的自动化流程成为应用开发的重要方向。</w:t>
+      </w:r>
+      <w:r>
+        <w:t xml:space="preserve"> </w:t>
+      </w:r>
+      <w:r>
+        <w:t xml:space="preserve">### </w:t>
+      </w:r>
+      <w:r>
+        <w:rPr>
+          <w:rFonts w:hint="eastAsia"/>
+        </w:rPr>
+        <w:t xml:space="preserve">（三）技术需求</w:t>
+      </w:r>
+      <w:r>
+        <w:t xml:space="preserve"> </w:t>
+      </w:r>
+      <w:r>
+        <w:rPr>
+          <w:rFonts w:hint="eastAsia"/>
+        </w:rPr>
+        <w:t xml:space="preserve">技术连接与集成的需求不断增加，社区成员在将不同的</w:t>
+      </w:r>
+      <w:r>
+        <w:t xml:space="preserve"> API </w:t>
+      </w:r>
+      <w:r>
+        <w:rPr>
+          <w:rFonts w:hint="eastAsia"/>
+        </w:rPr>
+        <w:t xml:space="preserve">和平台进行连接时遇到了各种问题，反映出对相关技术支持和教程的迫切需求。</w:t>
+      </w:r>
+      <w:r>
+        <w:t xml:space="preserve"> </w:t>
+      </w:r>
+      <w:r>
+        <w:t xml:space="preserve">### </w:t>
+      </w:r>
+      <w:r>
+        <w:rPr>
+          <w:rFonts w:hint="eastAsia"/>
+        </w:rPr>
+        <w:t xml:space="preserve">（四）销售策略转变</w:t>
+      </w:r>
+      <w:r>
+        <w:t xml:space="preserve"> </w:t>
+      </w:r>
+      <w:r>
+        <w:rPr>
+          <w:rFonts w:hint="eastAsia"/>
+        </w:rPr>
+        <w:t xml:space="preserve">随着</w:t>
+      </w:r>
+      <w:r>
+        <w:t xml:space="preserve"> AI </w:t>
+      </w:r>
+      <w:r>
+        <w:rPr>
+          <w:rFonts w:hint="eastAsia"/>
+        </w:rPr>
+        <w:t xml:space="preserve">市场的发展，B2B</w:t>
+      </w:r>
+      <w:r>
+        <w:t xml:space="preserve"> </w:t>
+      </w:r>
+      <w:r>
+        <w:rPr>
+          <w:rFonts w:hint="eastAsia"/>
+        </w:rPr>
+        <w:t xml:space="preserve">销售策略需要适应企业主的决策方式，从情感销售转向更注重实际价值和效益的销售方式。</w:t>
+      </w:r>
+      <w:r>
+        <w:t xml:space="preserve"> </w:t>
+      </w:r>
+      <w:r>
+        <w:t xml:space="preserve">### </w:t>
+      </w:r>
+      <w:r>
+        <w:rPr>
+          <w:rFonts w:hint="eastAsia"/>
+        </w:rPr>
+        <w:t xml:space="preserve">（五）学习与转型</w:t>
+      </w:r>
+      <w:r>
+        <w:t xml:space="preserve"> </w:t>
+      </w:r>
+      <w:r>
+        <w:rPr>
+          <w:rFonts w:hint="eastAsia"/>
+        </w:rPr>
+        <w:t xml:space="preserve">越来越多的人从传统行业转向</w:t>
+      </w:r>
+      <w:r>
+        <w:t xml:space="preserve"> AI </w:t>
+      </w:r>
+      <w:r>
+        <w:rPr>
+          <w:rFonts w:hint="eastAsia"/>
+        </w:rPr>
+        <w:t xml:space="preserve">领域，对学习和成长的需求增加，希望了解如何快速掌握技能并实现盈利。</w:t>
+      </w:r>
+    </w:p>
+    <w:bookmarkEnd w:id="14"/>
+    <w:bookmarkEnd w:id="15"/>
+    <w:bookmarkStart w:id="17" w:name="五结论与展望"/>
+    <w:p>
+      <w:pPr>
+        <w:pStyle w:val="Heading2"/>
+      </w:pPr>
+      <w:r>
+        <w:rPr>
+          <w:rFonts w:hint="eastAsia"/>
+        </w:rPr>
+        <w:t xml:space="preserve">五、结论与展望</w:t>
+      </w:r>
+    </w:p>
+    <w:bookmarkStart w:id="16" w:name="一结论"/>
+    <w:p>
+      <w:pPr>
+        <w:pStyle w:val="Heading3"/>
+      </w:pPr>
+      <w:r>
+        <w:rPr>
+          <w:rFonts w:hint="eastAsia"/>
+        </w:rPr>
+        <w:t xml:space="preserve">（一）结论</w:t>
+      </w:r>
+    </w:p>
+    <w:p>
+      <w:pPr>
+        <w:pStyle w:val="FirstParagraph"/>
+      </w:pPr>
+      <w:r>
+        <w:rPr>
+          <w:rFonts w:hint="eastAsia"/>
+        </w:rPr>
+        <w:t xml:space="preserve">通过对这些帖子的分析，可以看出</w:t>
+      </w:r>
+      <w:r>
+        <w:t xml:space="preserve"> AI </w:t>
+      </w:r>
+      <w:r>
+        <w:rPr>
+          <w:rFonts w:hint="eastAsia"/>
+        </w:rPr>
+        <w:t xml:space="preserve">自动化领域充满了机遇和挑战。创业合作、应用开发、技术连接、销售策略和学习成长是社区成员关注的主要方面。目前，AI</w:t>
+      </w:r>
+      <w:r>
+        <w:t xml:space="preserve"> </w:t>
+      </w:r>
+      <w:r>
+        <w:rPr>
+          <w:rFonts w:hint="eastAsia"/>
+        </w:rPr>
+        <w:t xml:space="preserve">应用在各个行业的渗透不断加深，但在技术实现和销售推广方面仍存在一些问题。</w:t>
+      </w:r>
+      <w:r>
+        <w:t xml:space="preserve"> </w:t>
+      </w:r>
+      <w:r>
+        <w:t xml:space="preserve">### </w:t>
+      </w:r>
+      <w:r>
+        <w:rPr>
+          <w:rFonts w:hint="eastAsia"/>
+        </w:rPr>
+        <w:t xml:space="preserve">（二）展望</w:t>
+      </w:r>
+      <w:r>
+        <w:t xml:space="preserve"> </w:t>
+      </w:r>
+      <w:r>
+        <w:rPr>
+          <w:rFonts w:hint="eastAsia"/>
+        </w:rPr>
+        <w:t xml:space="preserve">未来，随着</w:t>
+      </w:r>
+      <w:r>
+        <w:t xml:space="preserve"> AI </w:t>
+      </w:r>
+      <w:r>
+        <w:rPr>
+          <w:rFonts w:hint="eastAsia"/>
+        </w:rPr>
+        <w:t xml:space="preserve">技术的不断发展，预计会有更多创新的应用和商业模式出现。社区成员之间的合作将更加紧密，共同推动</w:t>
+      </w:r>
+      <w:r>
+        <w:t xml:space="preserve"> AI </w:t>
+      </w:r>
+      <w:r>
+        <w:rPr>
+          <w:rFonts w:hint="eastAsia"/>
+        </w:rPr>
+        <w:t xml:space="preserve">自动化领域的发展。同时，对技术支持和销售培训的需求也将促使相关服务的不断完善。建议社区成员加强交流与合作，分享经验和资源，共同应对挑战，抓住机遇，实现个人和行业的共同发展。</w:t>
+      </w:r>
+    </w:p>
+    <w:p>
+      <w:pPr>
         <w:pStyle w:val="SourceCode"/>
       </w:pPr>
       <w:r>
@@ -239,7 +1351,7 @@
           <w:rStyle w:val="VerbatimChar"/>
           <w:rFonts w:hint="eastAsia"/>
         </w:rPr>
-        <w:t xml:space="preserve">帖子数量：3</w:t>
+        <w:t xml:space="preserve">帖子数量：14</w:t>
       </w:r>
       <w:r>
         <w:br/>
@@ -274,6 +1386,8 @@
         <w:t xml:space="preserve">模型：doubao-1-5-pro-32k-250115</w:t>
       </w:r>
     </w:p>
+    <w:bookmarkEnd w:id="16"/>
+    <w:bookmarkEnd w:id="17"/>
     <w:sectPr>
       <w:footnotePr>
         <w:numRestart w:val="eachSect"/>
@@ -384,8 +1498,123 @@
       </w:pPr>
     </w:lvl>
   </w:abstractNum>
+  <w:abstractNum w:abstractNumId="99411">
+    <w:nsid w:val="00A99411"/>
+    <w:multiLevelType w:val="multilevel"/>
+    <w:lvl w:ilvl="0">
+      <w:start w:val="1"/>
+      <w:numFmt w:val="decimal"/>
+      <w:lvlText w:val="%1."/>
+      <w:lvlJc w:val="left"/>
+      <w:pPr>
+        <w:ind w:left="720" w:hanging="360"/>
+      </w:pPr>
+    </w:lvl>
+    <w:lvl w:ilvl="1">
+      <w:start w:val="1"/>
+      <w:numFmt w:val="decimal"/>
+      <w:lvlText w:val="%2."/>
+      <w:lvlJc w:val="left"/>
+      <w:pPr>
+        <w:ind w:left="1440" w:hanging="360"/>
+      </w:pPr>
+    </w:lvl>
+    <w:lvl w:ilvl="2">
+      <w:start w:val="1"/>
+      <w:numFmt w:val="decimal"/>
+      <w:lvlText w:val="%3."/>
+      <w:lvlJc w:val="left"/>
+      <w:pPr>
+        <w:ind w:left="2160" w:hanging="360"/>
+      </w:pPr>
+    </w:lvl>
+    <w:lvl w:ilvl="3">
+      <w:start w:val="1"/>
+      <w:numFmt w:val="decimal"/>
+      <w:lvlText w:val="%4."/>
+      <w:lvlJc w:val="left"/>
+      <w:pPr>
+        <w:ind w:left="2880" w:hanging="360"/>
+      </w:pPr>
+    </w:lvl>
+    <w:lvl w:ilvl="4">
+      <w:start w:val="1"/>
+      <w:numFmt w:val="decimal"/>
+      <w:lvlText w:val="%5."/>
+      <w:lvlJc w:val="left"/>
+      <w:pPr>
+        <w:ind w:left="3600" w:hanging="360"/>
+      </w:pPr>
+    </w:lvl>
+    <w:lvl w:ilvl="5">
+      <w:start w:val="1"/>
+      <w:numFmt w:val="decimal"/>
+      <w:lvlText w:val="%6."/>
+      <w:lvlJc w:val="left"/>
+      <w:pPr>
+        <w:ind w:left="4320" w:hanging="360"/>
+      </w:pPr>
+    </w:lvl>
+    <w:lvl w:ilvl="6">
+      <w:start w:val="1"/>
+      <w:numFmt w:val="decimal"/>
+      <w:lvlText w:val="%7."/>
+      <w:lvlJc w:val="left"/>
+      <w:pPr>
+        <w:ind w:left="5040" w:hanging="360"/>
+      </w:pPr>
+    </w:lvl>
+    <w:lvl w:ilvl="7">
+      <w:start w:val="1"/>
+      <w:numFmt w:val="decimal"/>
+      <w:lvlText w:val="%8."/>
+      <w:lvlJc w:val="left"/>
+      <w:pPr>
+        <w:ind w:left="5760" w:hanging="360"/>
+      </w:pPr>
+    </w:lvl>
+    <w:lvl w:ilvl="8">
+      <w:start w:val="1"/>
+      <w:numFmt w:val="decimal"/>
+      <w:lvlText w:val="%9."/>
+      <w:lvlJc w:val="left"/>
+      <w:pPr>
+        <w:ind w:left="6480" w:hanging="360"/>
+      </w:pPr>
+    </w:lvl>
+  </w:abstractNum>
   <w:num w:numId="1000">
     <w:abstractNumId w:val="990"/>
+  </w:num>
+  <w:num w:numId="1001">
+    <w:abstractNumId w:val="99411"/>
+    <w:lvlOverride w:ilvl="0">
+      <w:startOverride w:val="1"/>
+    </w:lvlOverride>
+    <w:lvlOverride w:ilvl="1">
+      <w:startOverride w:val="1"/>
+    </w:lvlOverride>
+    <w:lvlOverride w:ilvl="2">
+      <w:startOverride w:val="1"/>
+    </w:lvlOverride>
+    <w:lvlOverride w:ilvl="3">
+      <w:startOverride w:val="1"/>
+    </w:lvlOverride>
+    <w:lvlOverride w:ilvl="4">
+      <w:startOverride w:val="1"/>
+    </w:lvlOverride>
+    <w:lvlOverride w:ilvl="5">
+      <w:startOverride w:val="1"/>
+    </w:lvlOverride>
+    <w:lvlOverride w:ilvl="6">
+      <w:startOverride w:val="1"/>
+    </w:lvlOverride>
+    <w:lvlOverride w:ilvl="7">
+      <w:startOverride w:val="1"/>
+    </w:lvlOverride>
+    <w:lvlOverride w:ilvl="8">
+      <w:startOverride w:val="1"/>
+    </w:lvlOverride>
   </w:num>
 </w:numbering>
 </file>

</xml_diff>

<commit_message>
new prompt to enrich content
</commit_message>
<xml_diff>
--- a/skool_crawl/summary_doubao.docx
+++ b/skool_crawl/summary_doubao.docx
@@ -27,7 +27,7 @@
           <w:rStyle w:val="VerbatimChar"/>
           <w:rFonts w:hint="eastAsia"/>
         </w:rPr>
-        <w:t xml:space="preserve">生成时间：2025-11-17T06:56:23.118552+00:00</w:t>
+        <w:t xml:space="preserve">生成时间：2025-11-17T12:39:48.032697+00:00</w:t>
       </w:r>
       <w:r>
         <w:br/>
@@ -67,17 +67,17 @@
         <w:rPr>
           <w:rStyle w:val="VerbatimChar"/>
         </w:rPr>
-        <w:t xml:space="preserve"># AI </w:t>
+        <w:t xml:space="preserve"># </w:t>
       </w:r>
       <w:r>
         <w:rPr>
           <w:rStyle w:val="VerbatimChar"/>
           <w:rFonts w:hint="eastAsia"/>
         </w:rPr>
-        <w:t xml:space="preserve">自动化与创业相关讨论报告</w:t>
-      </w:r>
-    </w:p>
-    <w:bookmarkStart w:id="9" w:name="一引言"/>
+        <w:t xml:space="preserve">帖子数据研究报告</w:t>
+      </w:r>
+    </w:p>
+    <w:bookmarkStart w:id="9" w:name="引言"/>
     <w:p>
       <w:pPr>
         <w:pStyle w:val="Heading2"/>
@@ -86,7 +86,7 @@
         <w:rPr>
           <w:rFonts w:hint="eastAsia"/>
         </w:rPr>
-        <w:t xml:space="preserve">一、引言</w:t>
+        <w:t xml:space="preserve">引言</w:t>
       </w:r>
     </w:p>
     <w:p>
@@ -97,47 +97,11 @@
         <w:rPr>
           <w:rFonts w:hint="eastAsia"/>
         </w:rPr>
-        <w:t xml:space="preserve">本报告基于</w:t>
-      </w:r>
-      <w:r>
-        <w:t xml:space="preserve"> Skool </w:t>
-      </w:r>
-      <w:r>
-        <w:rPr>
-          <w:rFonts w:hint="eastAsia"/>
-        </w:rPr>
-        <w:t xml:space="preserve">平台上</w:t>
-      </w:r>
-      <w:r>
-        <w:t xml:space="preserve"> AI </w:t>
-      </w:r>
-      <w:r>
-        <w:rPr>
-          <w:rFonts w:hint="eastAsia"/>
-        </w:rPr>
-        <w:t xml:space="preserve">自动化社区的帖子数据，涵盖了创业合作、AI</w:t>
-      </w:r>
-      <w:r>
-        <w:t xml:space="preserve"> </w:t>
-      </w:r>
-      <w:r>
-        <w:rPr>
-          <w:rFonts w:hint="eastAsia"/>
-        </w:rPr>
-        <w:t xml:space="preserve">应用开发、销售策略、技术连接等多个方面的内容。通过对这些帖子的分析，旨在全面了解当前</w:t>
-      </w:r>
-      <w:r>
-        <w:t xml:space="preserve"> AI </w:t>
-      </w:r>
-      <w:r>
-        <w:rPr>
-          <w:rFonts w:hint="eastAsia"/>
-        </w:rPr>
-        <w:t xml:space="preserve">自动化领域的热点话题、发展趋势以及社区成员面临的问题与挑战。</w:t>
+        <w:t xml:space="preserve">本报告基于爬虫抓取的一系列帖子数据进行分析，这些帖子涵盖了多个领域的话题，包括求职技巧、业务拓展、技术工具应用等。通过对这些帖子的深入研究，旨在全面呈现其中的关键信息，挖掘潜在趋势和模式，为相关领域的从业者或研究者提供有价值的参考。</w:t>
       </w:r>
     </w:p>
     <w:bookmarkEnd w:id="9"/>
-    <w:bookmarkStart w:id="11" w:name="二主题提炼"/>
+    <w:bookmarkStart w:id="10" w:name="主题提炼"/>
     <w:p>
       <w:pPr>
         <w:pStyle w:val="Heading2"/>
@@ -146,10 +110,126 @@
         <w:rPr>
           <w:rFonts w:hint="eastAsia"/>
         </w:rPr>
-        <w:t xml:space="preserve">二、主题提炼</w:t>
-      </w:r>
-    </w:p>
-    <w:bookmarkStart w:id="10" w:name="一创业合作"/>
+        <w:t xml:space="preserve">主题提炼</w:t>
+      </w:r>
+    </w:p>
+    <w:p>
+      <w:pPr>
+        <w:pStyle w:val="FirstParagraph"/>
+      </w:pPr>
+      <w:r>
+        <w:rPr>
+          <w:rFonts w:hint="eastAsia"/>
+        </w:rPr>
+        <w:t xml:space="preserve">从抓取的帖子数据中可以提炼出以下几个主要主题：</w:t>
+      </w:r>
+      <w:r>
+        <w:t xml:space="preserve"> </w:t>
+      </w:r>
+      <w:r>
+        <w:t xml:space="preserve">1.</w:t>
+      </w:r>
+      <w:r>
+        <w:t xml:space="preserve"> </w:t>
+      </w:r>
+      <w:r>
+        <w:rPr>
+          <w:rFonts w:hint="eastAsia"/>
+          <w:b/>
+          <w:bCs/>
+        </w:rPr>
+        <w:t xml:space="preserve">求职与招聘</w:t>
+      </w:r>
+      <w:r>
+        <w:rPr>
+          <w:rFonts w:hint="eastAsia"/>
+        </w:rPr>
+        <w:t xml:space="preserve">：包含求职者的技巧分享以及招聘需求，如招聘预约安排人员等。</w:t>
+      </w:r>
+      <w:r>
+        <w:t xml:space="preserve"> </w:t>
+      </w:r>
+      <w:r>
+        <w:t xml:space="preserve">2.</w:t>
+      </w:r>
+      <w:r>
+        <w:t xml:space="preserve"> </w:t>
+      </w:r>
+      <w:r>
+        <w:rPr>
+          <w:rFonts w:hint="eastAsia"/>
+          <w:b/>
+          <w:bCs/>
+        </w:rPr>
+        <w:t xml:space="preserve">业务拓展与营销</w:t>
+      </w:r>
+      <w:r>
+        <w:rPr>
+          <w:rFonts w:hint="eastAsia"/>
+        </w:rPr>
+        <w:t xml:space="preserve">：涉及黑五活动的策划、无个人品牌时的服务报价结构等内容。</w:t>
+      </w:r>
+      <w:r>
+        <w:t xml:space="preserve"> </w:t>
+      </w:r>
+      <w:r>
+        <w:t xml:space="preserve">3.</w:t>
+      </w:r>
+      <w:r>
+        <w:t xml:space="preserve"> </w:t>
+      </w:r>
+      <w:r>
+        <w:rPr>
+          <w:rFonts w:hint="eastAsia"/>
+          <w:b/>
+          <w:bCs/>
+        </w:rPr>
+        <w:t xml:space="preserve">技术工具应用</w:t>
+      </w:r>
+      <w:r>
+        <w:rPr>
+          <w:rFonts w:hint="eastAsia"/>
+        </w:rPr>
+        <w:t xml:space="preserve">：以n8n为核心，包括n8n模板的整合、与其他工具的连接，以及利用n8n解决具体业务问题等。</w:t>
+      </w:r>
+      <w:r>
+        <w:t xml:space="preserve"> </w:t>
+      </w:r>
+      <w:r>
+        <w:t xml:space="preserve">4.</w:t>
+      </w:r>
+      <w:r>
+        <w:t xml:space="preserve"> </w:t>
+      </w:r>
+      <w:r>
+        <w:rPr>
+          <w:rFonts w:hint="eastAsia"/>
+          <w:b/>
+          <w:bCs/>
+        </w:rPr>
+        <w:t xml:space="preserve">人工智能与创新</w:t>
+      </w:r>
+      <w:r>
+        <w:rPr>
+          <w:rFonts w:hint="eastAsia"/>
+        </w:rPr>
+        <w:t xml:space="preserve">：涵盖AI系统构建、AI微SaaS产品开发等方面。</w:t>
+      </w:r>
+    </w:p>
+    <w:bookmarkEnd w:id="10"/>
+    <w:bookmarkStart w:id="15" w:name="帖子综述"/>
+    <w:p>
+      <w:pPr>
+        <w:pStyle w:val="Heading2"/>
+      </w:pPr>
+      <w:r>
+        <w:rPr>
+          <w:rFonts w:hint="eastAsia"/>
+        </w:rPr>
+        <w:t xml:space="preserve">帖子综述</w:t>
+      </w:r>
+    </w:p>
+    <w:bookmarkStart w:id="11" w:name="求职技巧分享"/>
     <w:p>
       <w:pPr>
         <w:pStyle w:val="Heading3"/>
@@ -158,7 +238,7 @@
         <w:rPr>
           <w:rFonts w:hint="eastAsia"/>
         </w:rPr>
-        <w:t xml:space="preserve">（一）创业合作</w:t>
+        <w:t xml:space="preserve">求职技巧分享</w:t>
       </w:r>
     </w:p>
     <w:p>
@@ -166,237 +246,26 @@
         <w:pStyle w:val="FirstParagraph"/>
       </w:pPr>
       <w:r>
-        <w:rPr>
-          <w:rFonts w:hint="eastAsia"/>
-        </w:rPr>
-        <w:t xml:space="preserve">包括寻找创业伙伴共同开展</w:t>
-      </w:r>
-      <w:r>
-        <w:t xml:space="preserve"> AI </w:t>
-      </w:r>
-      <w:r>
-        <w:rPr>
-          <w:rFonts w:hint="eastAsia"/>
-        </w:rPr>
-        <w:t xml:space="preserve">相关业务，如组建</w:t>
-      </w:r>
-      <w:r>
-        <w:t xml:space="preserve"> AI </w:t>
-      </w:r>
-      <w:r>
-        <w:rPr>
-          <w:rFonts w:hint="eastAsia"/>
-        </w:rPr>
-        <w:t xml:space="preserve">代理机构、开发</w:t>
-      </w:r>
-      <w:r>
-        <w:t xml:space="preserve"> AI </w:t>
-      </w:r>
-      <w:r>
-        <w:rPr>
-          <w:rFonts w:hint="eastAsia"/>
-        </w:rPr>
-        <w:t xml:space="preserve">微</w:t>
-      </w:r>
-      <w:r>
-        <w:t xml:space="preserve"> SaaS </w:t>
-      </w:r>
-      <w:r>
-        <w:rPr>
-          <w:rFonts w:hint="eastAsia"/>
-        </w:rPr>
-        <w:t xml:space="preserve">产品等。</w:t>
-      </w:r>
-      <w:r>
-        <w:t xml:space="preserve"> </w:t>
-      </w:r>
-      <w:r>
-        <w:t xml:space="preserve">### </w:t>
-      </w:r>
-      <w:r>
-        <w:rPr>
-          <w:rFonts w:hint="eastAsia"/>
-        </w:rPr>
-        <w:t xml:space="preserve">（二）AI</w:t>
-      </w:r>
-      <w:r>
-        <w:t xml:space="preserve"> </w:t>
-      </w:r>
-      <w:r>
-        <w:rPr>
-          <w:rFonts w:hint="eastAsia"/>
-        </w:rPr>
-        <w:t xml:space="preserve">应用开发</w:t>
-      </w:r>
-      <w:r>
-        <w:t xml:space="preserve"> </w:t>
-      </w:r>
-      <w:r>
-        <w:rPr>
-          <w:rFonts w:hint="eastAsia"/>
-        </w:rPr>
-        <w:t xml:space="preserve">涉及各个领域的</w:t>
-      </w:r>
-      <w:r>
-        <w:t xml:space="preserve"> AI </w:t>
-      </w:r>
-      <w:r>
-        <w:rPr>
-          <w:rFonts w:hint="eastAsia"/>
-        </w:rPr>
-        <w:t xml:space="preserve">应用开发项目，如客户体验代理、房地产批发线索生成自动化、客户保留与绩效智能代理等。</w:t>
-      </w:r>
-      <w:r>
-        <w:t xml:space="preserve"> </w:t>
-      </w:r>
-      <w:r>
-        <w:t xml:space="preserve">### </w:t>
-      </w:r>
-      <w:r>
-        <w:rPr>
-          <w:rFonts w:hint="eastAsia"/>
-        </w:rPr>
-        <w:t xml:space="preserve">（三）技术连接与集成</w:t>
-      </w:r>
-      <w:r>
-        <w:t xml:space="preserve"> </w:t>
-      </w:r>
-      <w:r>
-        <w:rPr>
-          <w:rFonts w:hint="eastAsia"/>
-        </w:rPr>
-        <w:t xml:space="preserve">主要讨论如何将不同的技术和平台进行连接与集成，以实现自动化流程，如连接</w:t>
-      </w:r>
-      <w:r>
-        <w:t xml:space="preserve"> Meta Graph API </w:t>
-      </w:r>
-      <w:r>
-        <w:rPr>
-          <w:rFonts w:hint="eastAsia"/>
-        </w:rPr>
-        <w:t xml:space="preserve">与</w:t>
-      </w:r>
-      <w:r>
-        <w:t xml:space="preserve"> </w:t>
-      </w:r>
-      <w:r>
-        <w:rPr>
-          <w:rFonts w:hint="eastAsia"/>
-        </w:rPr>
-        <w:t xml:space="preserve">n8n、连接</w:t>
-      </w:r>
-      <w:r>
-        <w:t xml:space="preserve"> Slack </w:t>
-      </w:r>
-      <w:r>
-        <w:rPr>
-          <w:rFonts w:hint="eastAsia"/>
-        </w:rPr>
-        <w:t xml:space="preserve">与</w:t>
-      </w:r>
-      <w:r>
-        <w:t xml:space="preserve"> n8n </w:t>
-      </w:r>
-      <w:r>
-        <w:rPr>
-          <w:rFonts w:hint="eastAsia"/>
-        </w:rPr>
-        <w:t xml:space="preserve">等。</w:t>
-      </w:r>
-      <w:r>
-        <w:t xml:space="preserve"> </w:t>
-      </w:r>
-      <w:r>
-        <w:t xml:space="preserve">### </w:t>
-      </w:r>
-      <w:r>
-        <w:rPr>
-          <w:rFonts w:hint="eastAsia"/>
-        </w:rPr>
-        <w:t xml:space="preserve">（四）销售策略</w:t>
-      </w:r>
-      <w:r>
-        <w:t xml:space="preserve"> </w:t>
-      </w:r>
-      <w:r>
-        <w:rPr>
-          <w:rFonts w:hint="eastAsia"/>
-        </w:rPr>
-        <w:t xml:space="preserve">探讨向企业主销售</w:t>
-      </w:r>
-      <w:r>
-        <w:t xml:space="preserve"> AI </w:t>
-      </w:r>
-      <w:r>
-        <w:rPr>
-          <w:rFonts w:hint="eastAsia"/>
-        </w:rPr>
-        <w:t xml:space="preserve">产品的有效策略，强调</w:t>
-      </w:r>
-      <w:r>
-        <w:t xml:space="preserve"> B2B </w:t>
-      </w:r>
-      <w:r>
-        <w:rPr>
-          <w:rFonts w:hint="eastAsia"/>
-        </w:rPr>
-        <w:t xml:space="preserve">销售与</w:t>
-      </w:r>
-      <w:r>
-        <w:t xml:space="preserve"> B2C </w:t>
-      </w:r>
-      <w:r>
-        <w:rPr>
-          <w:rFonts w:hint="eastAsia"/>
-        </w:rPr>
-        <w:t xml:space="preserve">销售的差异。</w:t>
-      </w:r>
-      <w:r>
-        <w:t xml:space="preserve"> </w:t>
-      </w:r>
-      <w:r>
-        <w:t xml:space="preserve">### </w:t>
-      </w:r>
-      <w:r>
-        <w:rPr>
-          <w:rFonts w:hint="eastAsia"/>
-        </w:rPr>
-        <w:t xml:space="preserve">（五）学习与成长</w:t>
-      </w:r>
-      <w:r>
-        <w:t xml:space="preserve"> </w:t>
-      </w:r>
-      <w:r>
-        <w:rPr>
-          <w:rFonts w:hint="eastAsia"/>
-        </w:rPr>
-        <w:t xml:space="preserve">有成员分享从传统行业转型到</w:t>
-      </w:r>
-      <w:r>
-        <w:t xml:space="preserve"> AI </w:t>
-      </w:r>
-      <w:r>
-        <w:rPr>
-          <w:rFonts w:hint="eastAsia"/>
-        </w:rPr>
-        <w:t xml:space="preserve">领域的经历，并询问开始盈利所需的时间和学习曲线。</w:t>
-      </w:r>
-    </w:p>
-    <w:bookmarkEnd w:id="10"/>
+        <w:t xml:space="preserve">Emma </w:t>
+      </w:r>
+      <w:r>
+        <w:rPr>
+          <w:rFonts w:hint="eastAsia"/>
+        </w:rPr>
+        <w:t xml:space="preserve">Wilson分享了让雇主立即注意到求职者的七个技巧。首先，简历只有6秒的时间来给招聘者留下深刻印象，因此应将最强的成就、技能和职位名称放在简历的前三分之一处。其次，停止发送通用简历，要根据关键词、ATS短语和公司的职位描述来量身定制。再者，用数据说话，用成就陈述取代职责描述，如“将销售额提高了40%”。此外，LinkedIn资料相当于在线简历，要创建一个有力的标题、引人入胜的“关于”部分，并使用行业关键词，因为90%的雇主在筛选候选人之前会查看LinkedIn资料。同时，避免到处使用相同的求职信，要以吸引人的内容开头，解决公司的问题，并展示自己的价值主张。如果简历超过两页，需要删除重复内容，专注于影响陈述，并突出核心技能。最后，即使有完美的简历，也需要有求职策略，只申请满足60</w:t>
+      </w:r>
+      <w:r>
+        <w:t xml:space="preserve"> - </w:t>
+      </w:r>
+      <w:r>
+        <w:rPr>
+          <w:rFonts w:hint="eastAsia"/>
+        </w:rPr>
+        <w:t xml:space="preserve">70%要求且符合职业目标的工作。</w:t>
+      </w:r>
+    </w:p>
     <w:bookmarkEnd w:id="11"/>
-    <w:bookmarkStart w:id="13" w:name="三帖子综述"/>
-    <w:p>
-      <w:pPr>
-        <w:pStyle w:val="Heading2"/>
-      </w:pPr>
-      <w:r>
-        <w:rPr>
-          <w:rFonts w:hint="eastAsia"/>
-        </w:rPr>
-        <w:t xml:space="preserve">三、帖子综述</w:t>
-      </w:r>
-    </w:p>
-    <w:bookmarkStart w:id="12" w:name="一创业合作类"/>
+    <w:bookmarkStart w:id="12" w:name="业务拓展相关"/>
     <w:p>
       <w:pPr>
         <w:pStyle w:val="Heading3"/>
@@ -405,7 +274,7 @@
         <w:rPr>
           <w:rFonts w:hint="eastAsia"/>
         </w:rPr>
-        <w:t xml:space="preserve">（一）创业合作类</w:t>
+        <w:t xml:space="preserve">业务拓展相关</w:t>
       </w:r>
     </w:p>
     <w:p>
@@ -422,55 +291,22 @@
           <w:b/>
           <w:bCs/>
         </w:rPr>
-        <w:t xml:space="preserve">寻找</w:t>
-      </w:r>
-      <w:r>
-        <w:rPr>
-          <w:b/>
-          <w:bCs/>
-        </w:rPr>
-        <w:t xml:space="preserve"> AI </w:t>
-      </w:r>
-      <w:r>
-        <w:rPr>
-          <w:rFonts w:hint="eastAsia"/>
-          <w:b/>
-          <w:bCs/>
-        </w:rPr>
-        <w:t xml:space="preserve">代理机构创业伙伴</w:t>
-      </w:r>
-      <w:r>
-        <w:rPr>
-          <w:rFonts w:hint="eastAsia"/>
-        </w:rPr>
-        <w:t xml:space="preserve">：Joseph</w:t>
-      </w:r>
-      <w:r>
-        <w:t xml:space="preserve"> Mondragon </w:t>
-      </w:r>
-      <w:r>
-        <w:rPr>
-          <w:rFonts w:hint="eastAsia"/>
-        </w:rPr>
-        <w:t xml:space="preserve">寻找能处理</w:t>
-      </w:r>
-      <w:r>
-        <w:t xml:space="preserve"> n8n </w:t>
-      </w:r>
-      <w:r>
-        <w:rPr>
-          <w:rFonts w:hint="eastAsia"/>
-        </w:rPr>
-        <w:t xml:space="preserve">技术和自动化项目的人员加入</w:t>
-      </w:r>
-      <w:r>
-        <w:t xml:space="preserve"> AI </w:t>
-      </w:r>
-      <w:r>
-        <w:rPr>
-          <w:rFonts w:hint="eastAsia"/>
-        </w:rPr>
-        <w:t xml:space="preserve">代理机构创业团队。</w:t>
+        <w:t xml:space="preserve">黑五活动策划</w:t>
+      </w:r>
+      <w:r>
+        <w:rPr>
+          <w:rFonts w:hint="eastAsia"/>
+        </w:rPr>
+        <w:t xml:space="preserve">：Nazmul</w:t>
+      </w:r>
+      <w:r>
+        <w:t xml:space="preserve"> </w:t>
+      </w:r>
+      <w:r>
+        <w:rPr>
+          <w:rFonts w:hint="eastAsia"/>
+        </w:rPr>
+        <w:t xml:space="preserve">Hasan发起讨论，询问创业者在即将到来的黑五计划推出什么，如新产品、大幅折扣、巧妙的捆绑销售、自动化方案等。</w:t>
       </w:r>
     </w:p>
     <w:p>
@@ -487,76 +323,44 @@
           <w:b/>
           <w:bCs/>
         </w:rPr>
-        <w:t xml:space="preserve">寻找</w:t>
-      </w:r>
-      <w:r>
-        <w:rPr>
-          <w:b/>
-          <w:bCs/>
-        </w:rPr>
-        <w:t xml:space="preserve"> AI </w:t>
-      </w:r>
-      <w:r>
-        <w:rPr>
-          <w:rFonts w:hint="eastAsia"/>
-          <w:b/>
-          <w:bCs/>
-        </w:rPr>
-        <w:t xml:space="preserve">代理和工作流经验伙伴</w:t>
-      </w:r>
-      <w:r>
-        <w:rPr>
-          <w:rFonts w:hint="eastAsia"/>
-        </w:rPr>
-        <w:t xml:space="preserve">：Carson</w:t>
-      </w:r>
-      <w:r>
-        <w:t xml:space="preserve"> Kim </w:t>
-      </w:r>
-      <w:r>
-        <w:rPr>
-          <w:rFonts w:hint="eastAsia"/>
-        </w:rPr>
-        <w:t xml:space="preserve">希望与有构建</w:t>
-      </w:r>
-      <w:r>
-        <w:t xml:space="preserve"> AI </w:t>
-      </w:r>
-      <w:r>
-        <w:rPr>
-          <w:rFonts w:hint="eastAsia"/>
-        </w:rPr>
-        <w:t xml:space="preserve">代理和工作流经验的人合作，共同打造高利润的</w:t>
-      </w:r>
-      <w:r>
-        <w:t xml:space="preserve"> AI </w:t>
-      </w:r>
-      <w:r>
-        <w:rPr>
-          <w:rFonts w:hint="eastAsia"/>
-        </w:rPr>
-        <w:t xml:space="preserve">代理机构。</w:t>
-      </w:r>
-      <w:r>
-        <w:t xml:space="preserve"> </w:t>
-      </w:r>
-      <w:r>
-        <w:t xml:space="preserve">### </w:t>
-      </w:r>
-      <w:r>
-        <w:rPr>
-          <w:rFonts w:hint="eastAsia"/>
-        </w:rPr>
-        <w:t xml:space="preserve">（二）AI</w:t>
-      </w:r>
-      <w:r>
-        <w:t xml:space="preserve"> </w:t>
-      </w:r>
-      <w:r>
-        <w:rPr>
-          <w:rFonts w:hint="eastAsia"/>
-        </w:rPr>
-        <w:t xml:space="preserve">应用开发类</w:t>
+        <w:t xml:space="preserve">无个人品牌时的服务报价</w:t>
+      </w:r>
+      <w:r>
+        <w:rPr>
+          <w:rFonts w:hint="eastAsia"/>
+        </w:rPr>
+        <w:t xml:space="preserve">：Guarracino</w:t>
+      </w:r>
+      <w:r>
+        <w:t xml:space="preserve"> </w:t>
+      </w:r>
+      <w:r>
+        <w:rPr>
+          <w:rFonts w:hint="eastAsia"/>
+        </w:rPr>
+        <w:t xml:space="preserve">Alessandro在构建首个服务报价时感到困惑，他提到Alex</w:t>
+      </w:r>
+      <w:r>
+        <w:t xml:space="preserve"> </w:t>
+      </w:r>
+      <w:r>
+        <w:rPr>
+          <w:rFonts w:hint="eastAsia"/>
+        </w:rPr>
+        <w:t xml:space="preserve">Hormozi的观点，一方面要在与客户关系的前30天尽可能多地收款，另一方面要尽量降低客户的感知风险。他陷入了两种方案的抉择：一是提前收费，如一开始收取1500美元，然后提供服务；二是消除所有风险，先为潜在客户工作，若客户满意再收取1500美元。</w:t>
+      </w:r>
+    </w:p>
+    <w:bookmarkEnd w:id="12"/>
+    <w:bookmarkStart w:id="13" w:name="技术工具应用"/>
+    <w:p>
+      <w:pPr>
+        <w:pStyle w:val="Heading3"/>
+      </w:pPr>
+      <w:r>
+        <w:rPr>
+          <w:rFonts w:hint="eastAsia"/>
+        </w:rPr>
+        <w:t xml:space="preserve">技术工具应用</w:t>
       </w:r>
     </w:p>
     <w:p>
@@ -564,80 +368,31 @@
         <w:pStyle w:val="Compact"/>
         <w:numPr>
           <w:ilvl w:val="0"/>
-          <w:numId w:val="1001"/>
+          <w:numId w:val="1002"/>
         </w:numPr>
       </w:pPr>
       <w:r>
         <w:rPr>
+          <w:rFonts w:hint="eastAsia"/>
           <w:b/>
           <w:bCs/>
         </w:rPr>
-        <w:t xml:space="preserve">AI </w:t>
-      </w:r>
-      <w:r>
-        <w:rPr>
-          <w:rFonts w:hint="eastAsia"/>
-          <w:b/>
-          <w:bCs/>
-        </w:rPr>
-        <w:t xml:space="preserve">微</w:t>
-      </w:r>
-      <w:r>
-        <w:rPr>
-          <w:b/>
-          <w:bCs/>
-        </w:rPr>
-        <w:t xml:space="preserve"> SaaS </w:t>
-      </w:r>
-      <w:r>
-        <w:rPr>
-          <w:rFonts w:hint="eastAsia"/>
-          <w:b/>
-          <w:bCs/>
-        </w:rPr>
-        <w:t xml:space="preserve">产品</w:t>
-      </w:r>
-      <w:r>
-        <w:rPr>
-          <w:rFonts w:hint="eastAsia"/>
-        </w:rPr>
-        <w:t xml:space="preserve">：Gian</w:t>
-      </w:r>
-      <w:r>
-        <w:t xml:space="preserve"> Gallegos </w:t>
-      </w:r>
-      <w:r>
-        <w:rPr>
-          <w:rFonts w:hint="eastAsia"/>
-        </w:rPr>
-        <w:t xml:space="preserve">为菲律宾单身市场开发了</w:t>
-      </w:r>
-      <w:r>
-        <w:t xml:space="preserve"> AI </w:t>
-      </w:r>
-      <w:r>
-        <w:rPr>
-          <w:rFonts w:hint="eastAsia"/>
-        </w:rPr>
-        <w:t xml:space="preserve">驱动的费用跟踪器</w:t>
-      </w:r>
-      <w:r>
-        <w:t xml:space="preserve"> </w:t>
-      </w:r>
-      <w:r>
-        <w:rPr>
-          <w:rFonts w:hint="eastAsia"/>
-        </w:rPr>
-        <w:t xml:space="preserve">ResiboKo，利用</w:t>
-      </w:r>
-      <w:r>
-        <w:t xml:space="preserve"> Gemini 2.5 </w:t>
-      </w:r>
-      <w:r>
-        <w:rPr>
-          <w:rFonts w:hint="eastAsia"/>
-        </w:rPr>
-        <w:t xml:space="preserve">技术解决单身人士的财务管理问题。</w:t>
+        <w:t xml:space="preserve">n8n模板整合</w:t>
+      </w:r>
+      <w:r>
+        <w:rPr>
+          <w:rFonts w:hint="eastAsia"/>
+        </w:rPr>
+        <w:t xml:space="preserve">：Duy</w:t>
+      </w:r>
+      <w:r>
+        <w:t xml:space="preserve"> </w:t>
+      </w:r>
+      <w:r>
+        <w:rPr>
+          <w:rFonts w:hint="eastAsia"/>
+        </w:rPr>
+        <w:t xml:space="preserve">Bui将三个流行的n8n模板（文档分类器、数据提取器、CRM发布器）整合为一个文档智能系统。原本三个工作流程分开运行，需要手动交接和监控，处理一份文档需要8分钟，还经常出现延误。整合后，形成了一个全自动的工作流程，从文档到达、分类、提取数据、发布到CRM再到通知，零手动步骤，处理一份文档仅需30秒，每月可处理80份文档，每月节省8小时，错误率降低75%。</w:t>
       </w:r>
     </w:p>
     <w:p>
@@ -645,7 +400,7 @@
         <w:pStyle w:val="Compact"/>
         <w:numPr>
           <w:ilvl w:val="0"/>
-          <w:numId w:val="1001"/>
+          <w:numId w:val="1002"/>
         </w:numPr>
       </w:pPr>
       <w:r>
@@ -654,40 +409,22 @@
           <w:b/>
           <w:bCs/>
         </w:rPr>
-        <w:t xml:space="preserve">客户体验代理</w:t>
-      </w:r>
-      <w:r>
-        <w:rPr>
-          <w:rFonts w:hint="eastAsia"/>
-        </w:rPr>
-        <w:t xml:space="preserve">：Muhammad</w:t>
-      </w:r>
-      <w:r>
-        <w:t xml:space="preserve"> Arhan </w:t>
-      </w:r>
-      <w:r>
-        <w:rPr>
-          <w:rFonts w:hint="eastAsia"/>
-        </w:rPr>
-        <w:t xml:space="preserve">完成了</w:t>
-      </w:r>
-      <w:r>
-        <w:t xml:space="preserve"> </w:t>
-      </w:r>
-      <w:r>
-        <w:rPr>
-          <w:rFonts w:hint="eastAsia"/>
-        </w:rPr>
-        <w:t xml:space="preserve">95%的</w:t>
-      </w:r>
-      <w:r>
-        <w:t xml:space="preserve"> CX </w:t>
-      </w:r>
-      <w:r>
-        <w:rPr>
-          <w:rFonts w:hint="eastAsia"/>
-        </w:rPr>
-        <w:t xml:space="preserve">代理项目，该代理针对医疗美容领域，可实现聊天、预约管理等功能，并具备个性化响应和跟进自动化能力。</w:t>
+        <w:t xml:space="preserve">Jotform与n8n结合</w:t>
+      </w:r>
+      <w:r>
+        <w:rPr>
+          <w:rFonts w:hint="eastAsia"/>
+        </w:rPr>
+        <w:t xml:space="preserve">：Roland</w:t>
+      </w:r>
+      <w:r>
+        <w:t xml:space="preserve"> </w:t>
+      </w:r>
+      <w:r>
+        <w:rPr>
+          <w:rFonts w:hint="eastAsia"/>
+        </w:rPr>
+        <w:t xml:space="preserve">Jungenkrueger提到Jotform在数字表单、文档签署、低代码应用创建等方面功能强大，但某些功能不完善。为满足客户对动态PDF报告的需求，他利用n8n构建了一个全面的解决方案，包括自动预填充数据上传和动态电子邮件创建并附带PDF报告。</w:t>
       </w:r>
     </w:p>
     <w:p>
@@ -695,7 +432,7 @@
         <w:pStyle w:val="Compact"/>
         <w:numPr>
           <w:ilvl w:val="0"/>
-          <w:numId w:val="1001"/>
+          <w:numId w:val="1002"/>
         </w:numPr>
       </w:pPr>
       <w:r>
@@ -704,34 +441,35 @@
           <w:b/>
           <w:bCs/>
         </w:rPr>
-        <w:t xml:space="preserve">房地产批发线索生成自动化</w:t>
-      </w:r>
-      <w:r>
-        <w:rPr>
-          <w:rFonts w:hint="eastAsia"/>
-        </w:rPr>
-        <w:t xml:space="preserve">：Wisdom</w:t>
-      </w:r>
-      <w:r>
-        <w:t xml:space="preserve"> Akogwu </w:t>
-      </w:r>
-      <w:r>
-        <w:rPr>
-          <w:rFonts w:hint="eastAsia"/>
-        </w:rPr>
-        <w:t xml:space="preserve">分享了在</w:t>
-      </w:r>
-      <w:r>
-        <w:t xml:space="preserve"> Make.com </w:t>
-      </w:r>
-      <w:r>
-        <w:rPr>
-          <w:rFonts w:hint="eastAsia"/>
-        </w:rPr>
-        <w:t xml:space="preserve">上构建的房地产线索生成场景，可自动捕获、验证和跟踪卖家线索，并将其路由到</w:t>
-      </w:r>
-      <w:r>
-        <w:t xml:space="preserve"> CRM。</w:t>
+        <w:t xml:space="preserve">n8n与Slack连接</w:t>
+      </w:r>
+      <w:r>
+        <w:rPr>
+          <w:rFonts w:hint="eastAsia"/>
+        </w:rPr>
+        <w:t xml:space="preserve">：Folu</w:t>
+      </w:r>
+      <w:r>
+        <w:t xml:space="preserve"> </w:t>
+      </w:r>
+      <w:r>
+        <w:rPr>
+          <w:rFonts w:hint="eastAsia"/>
+        </w:rPr>
+        <w:t xml:space="preserve">Ilori分享了关于如何将Slack连接到n8n以用于AI代理的2026年更新视频链接。</w:t>
+      </w:r>
+    </w:p>
+    <w:bookmarkEnd w:id="13"/>
+    <w:bookmarkStart w:id="14" w:name="人工智能与创新"/>
+    <w:p>
+      <w:pPr>
+        <w:pStyle w:val="Heading3"/>
+      </w:pPr>
+      <w:r>
+        <w:rPr>
+          <w:rFonts w:hint="eastAsia"/>
+        </w:rPr>
+        <w:t xml:space="preserve">人工智能与创新</w:t>
       </w:r>
     </w:p>
     <w:p>
@@ -739,7 +477,7 @@
         <w:pStyle w:val="Compact"/>
         <w:numPr>
           <w:ilvl w:val="0"/>
-          <w:numId w:val="1001"/>
+          <w:numId w:val="1003"/>
         </w:numPr>
       </w:pPr>
       <w:r>
@@ -748,34 +486,31 @@
           <w:b/>
           <w:bCs/>
         </w:rPr>
-        <w:t xml:space="preserve">客户保留与绩效智能代理</w:t>
-      </w:r>
-      <w:r>
-        <w:rPr>
-          <w:rFonts w:hint="eastAsia"/>
-        </w:rPr>
-        <w:t xml:space="preserve">：Muskan</w:t>
-      </w:r>
-      <w:r>
-        <w:t xml:space="preserve"> Ahlawat </w:t>
-      </w:r>
-      <w:r>
-        <w:rPr>
-          <w:rFonts w:hint="eastAsia"/>
-        </w:rPr>
-        <w:t xml:space="preserve">构建了客户保留与绩效智能代理，每周可拉取客户数据和自动化指标，计算保留分数，标记高风险客户，并生成报告发送给客户和团队。</w:t>
-      </w:r>
-      <w:r>
-        <w:t xml:space="preserve"> </w:t>
-      </w:r>
-      <w:r>
-        <w:t xml:space="preserve">### </w:t>
-      </w:r>
-      <w:r>
-        <w:rPr>
-          <w:rFonts w:hint="eastAsia"/>
-        </w:rPr>
-        <w:t xml:space="preserve">（三）技术连接与集成类</w:t>
+        <w:t xml:space="preserve">AI微SaaS产品</w:t>
+      </w:r>
+      <w:r>
+        <w:rPr>
+          <w:rFonts w:hint="eastAsia"/>
+        </w:rPr>
+        <w:t xml:space="preserve">：Gian</w:t>
+      </w:r>
+      <w:r>
+        <w:t xml:space="preserve"> </w:t>
+      </w:r>
+      <w:r>
+        <w:rPr>
+          <w:rFonts w:hint="eastAsia"/>
+        </w:rPr>
+        <w:t xml:space="preserve">Gallegos为菲律宾3400多万单身人士打造了一款名为ResiboKo的AI驱动的费用跟踪器。单身人士的财务状况与家庭不同，存在如Grab打车、Jollibee消费、GCash冲动购买、咖啡约会和周末旅行等独特的财务“混乱”情况。该产品的“Piso”AI教练可帮助发现个人现金漏洞和节省机会，由Gemini</w:t>
+      </w:r>
+      <w:r>
+        <w:t xml:space="preserve"> </w:t>
+      </w:r>
+      <w:r>
+        <w:rPr>
+          <w:rFonts w:hint="eastAsia"/>
+        </w:rPr>
+        <w:t xml:space="preserve">2.5提供支持，能扫描当地收据或记录语音笔记。</w:t>
       </w:r>
     </w:p>
     <w:p>
@@ -783,7 +518,7 @@
         <w:pStyle w:val="Compact"/>
         <w:numPr>
           <w:ilvl w:val="0"/>
-          <w:numId w:val="1001"/>
+          <w:numId w:val="1003"/>
         </w:numPr>
       </w:pPr>
       <w:r>
@@ -792,431 +527,27 @@
           <w:b/>
           <w:bCs/>
         </w:rPr>
-        <w:t xml:space="preserve">连接</w:t>
-      </w:r>
-      <w:r>
-        <w:rPr>
-          <w:b/>
-          <w:bCs/>
-        </w:rPr>
-        <w:t xml:space="preserve"> Meta Graph API </w:t>
-      </w:r>
-      <w:r>
-        <w:rPr>
-          <w:rFonts w:hint="eastAsia"/>
-          <w:b/>
-          <w:bCs/>
-        </w:rPr>
-        <w:t xml:space="preserve">与</w:t>
-      </w:r>
-      <w:r>
-        <w:rPr>
-          <w:b/>
-          <w:bCs/>
-        </w:rPr>
-        <w:t xml:space="preserve"> n8n</w:t>
-      </w:r>
-      <w:r>
-        <w:rPr>
-          <w:rFonts w:hint="eastAsia"/>
-        </w:rPr>
-        <w:t xml:space="preserve">：Mateo</w:t>
-      </w:r>
-      <w:r>
-        <w:t xml:space="preserve"> Combet </w:t>
-      </w:r>
-      <w:r>
-        <w:rPr>
-          <w:rFonts w:hint="eastAsia"/>
-        </w:rPr>
-        <w:t xml:space="preserve">在构建</w:t>
-      </w:r>
-      <w:r>
-        <w:t xml:space="preserve"> n8n </w:t>
-      </w:r>
-      <w:r>
-        <w:rPr>
-          <w:rFonts w:hint="eastAsia"/>
-        </w:rPr>
-        <w:t xml:space="preserve">自动化时遇到连接</w:t>
-      </w:r>
-      <w:r>
-        <w:t xml:space="preserve"> Meta Graph API </w:t>
-      </w:r>
-      <w:r>
-        <w:rPr>
-          <w:rFonts w:hint="eastAsia"/>
-        </w:rPr>
-        <w:t xml:space="preserve">的问题，对令牌流程感到困惑，寻求相关教程和设置指导。</w:t>
-      </w:r>
-    </w:p>
-    <w:p>
-      <w:pPr>
-        <w:pStyle w:val="Compact"/>
-        <w:numPr>
-          <w:ilvl w:val="0"/>
-          <w:numId w:val="1001"/>
-        </w:numPr>
-      </w:pPr>
-      <w:r>
-        <w:rPr>
-          <w:rFonts w:hint="eastAsia"/>
-          <w:b/>
-          <w:bCs/>
-        </w:rPr>
-        <w:t xml:space="preserve">连接</w:t>
-      </w:r>
-      <w:r>
-        <w:rPr>
-          <w:b/>
-          <w:bCs/>
-        </w:rPr>
-        <w:t xml:space="preserve"> Slack </w:t>
-      </w:r>
-      <w:r>
-        <w:rPr>
-          <w:rFonts w:hint="eastAsia"/>
-          <w:b/>
-          <w:bCs/>
-        </w:rPr>
-        <w:t xml:space="preserve">与</w:t>
-      </w:r>
-      <w:r>
-        <w:rPr>
-          <w:b/>
-          <w:bCs/>
-        </w:rPr>
-        <w:t xml:space="preserve"> n8n</w:t>
-      </w:r>
-      <w:r>
-        <w:rPr>
-          <w:rFonts w:hint="eastAsia"/>
-        </w:rPr>
-        <w:t xml:space="preserve">：Folu</w:t>
-      </w:r>
-      <w:r>
-        <w:t xml:space="preserve"> Ilori </w:t>
-      </w:r>
-      <w:r>
-        <w:rPr>
-          <w:rFonts w:hint="eastAsia"/>
-        </w:rPr>
-        <w:t xml:space="preserve">分享了关于如何连接</w:t>
-      </w:r>
-      <w:r>
-        <w:t xml:space="preserve"> Slack </w:t>
-      </w:r>
-      <w:r>
-        <w:rPr>
-          <w:rFonts w:hint="eastAsia"/>
-        </w:rPr>
-        <w:t xml:space="preserve">与</w:t>
-      </w:r>
-      <w:r>
-        <w:t xml:space="preserve"> n8n </w:t>
-      </w:r>
-      <w:r>
-        <w:rPr>
-          <w:rFonts w:hint="eastAsia"/>
-        </w:rPr>
-        <w:t xml:space="preserve">用于</w:t>
-      </w:r>
-      <w:r>
-        <w:t xml:space="preserve"> AI </w:t>
-      </w:r>
-      <w:r>
-        <w:rPr>
-          <w:rFonts w:hint="eastAsia"/>
-        </w:rPr>
-        <w:t xml:space="preserve">代理的视频链接。</w:t>
-      </w:r>
-      <w:r>
-        <w:t xml:space="preserve"> </w:t>
-      </w:r>
-      <w:r>
-        <w:t xml:space="preserve">### </w:t>
-      </w:r>
-      <w:r>
-        <w:rPr>
-          <w:rFonts w:hint="eastAsia"/>
-        </w:rPr>
-        <w:t xml:space="preserve">（四）销售策略类</w:t>
-      </w:r>
-      <w:r>
-        <w:t xml:space="preserve"> </w:t>
-      </w:r>
-      <w:r>
-        <w:t xml:space="preserve">Michael Essien </w:t>
-      </w:r>
-      <w:r>
-        <w:rPr>
-          <w:rFonts w:hint="eastAsia"/>
-        </w:rPr>
-        <w:t xml:space="preserve">指出向企业主销售</w:t>
-      </w:r>
-      <w:r>
-        <w:t xml:space="preserve"> AI </w:t>
-      </w:r>
-      <w:r>
-        <w:rPr>
-          <w:rFonts w:hint="eastAsia"/>
-        </w:rPr>
-        <w:t xml:space="preserve">产品时，B2B</w:t>
-      </w:r>
-      <w:r>
-        <w:t xml:space="preserve"> </w:t>
-      </w:r>
-      <w:r>
-        <w:rPr>
-          <w:rFonts w:hint="eastAsia"/>
-        </w:rPr>
-        <w:t xml:space="preserve">销售不应采用</w:t>
-      </w:r>
-      <w:r>
-        <w:t xml:space="preserve"> B2C </w:t>
-      </w:r>
-      <w:r>
-        <w:rPr>
-          <w:rFonts w:hint="eastAsia"/>
-        </w:rPr>
-        <w:t xml:space="preserve">的情感销售方式，应采用更有效的销售流程。</w:t>
-      </w:r>
-      <w:r>
-        <w:t xml:space="preserve"> </w:t>
-      </w:r>
-      <w:r>
-        <w:t xml:space="preserve">### </w:t>
-      </w:r>
-      <w:r>
-        <w:rPr>
-          <w:rFonts w:hint="eastAsia"/>
-        </w:rPr>
-        <w:t xml:space="preserve">（五）学习与成长类</w:t>
-      </w:r>
-      <w:r>
-        <w:t xml:space="preserve"> </w:t>
-      </w:r>
-      <w:r>
-        <w:t xml:space="preserve">Guarracino Alessandro </w:t>
-      </w:r>
-      <w:r>
-        <w:rPr>
-          <w:rFonts w:hint="eastAsia"/>
-        </w:rPr>
-        <w:t xml:space="preserve">从酒店行业转型到</w:t>
-      </w:r>
-      <w:r>
-        <w:t xml:space="preserve"> AI </w:t>
-      </w:r>
-      <w:r>
-        <w:rPr>
-          <w:rFonts w:hint="eastAsia"/>
-        </w:rPr>
-        <w:t xml:space="preserve">领域，询问开始提供</w:t>
-      </w:r>
-      <w:r>
-        <w:t xml:space="preserve"> AI </w:t>
-      </w:r>
-      <w:r>
-        <w:rPr>
-          <w:rFonts w:hint="eastAsia"/>
-        </w:rPr>
-        <w:t xml:space="preserve">相关服务并实现盈利所需的时间和学习曲线。</w:t>
-      </w:r>
-    </w:p>
-    <w:bookmarkEnd w:id="12"/>
-    <w:bookmarkEnd w:id="13"/>
-    <w:bookmarkStart w:id="15" w:name="四趋势与模式分析"/>
-    <w:p>
-      <w:pPr>
-        <w:pStyle w:val="Heading2"/>
-      </w:pPr>
-      <w:r>
-        <w:rPr>
-          <w:rFonts w:hint="eastAsia"/>
-        </w:rPr>
-        <w:t xml:space="preserve">四、趋势与模式分析</w:t>
-      </w:r>
-    </w:p>
-    <w:bookmarkStart w:id="14" w:name="一创业趋势"/>
-    <w:p>
-      <w:pPr>
-        <w:pStyle w:val="Heading3"/>
-      </w:pPr>
-      <w:r>
-        <w:rPr>
-          <w:rFonts w:hint="eastAsia"/>
-        </w:rPr>
-        <w:t xml:space="preserve">（一）创业趋势</w:t>
-      </w:r>
-    </w:p>
-    <w:p>
-      <w:pPr>
-        <w:pStyle w:val="FirstParagraph"/>
-      </w:pPr>
-      <w:r>
-        <w:t xml:space="preserve">AI </w:t>
-      </w:r>
-      <w:r>
-        <w:rPr>
-          <w:rFonts w:hint="eastAsia"/>
-        </w:rPr>
-        <w:t xml:space="preserve">领域的创业热情高涨，越来越多的人希望通过合作开展</w:t>
-      </w:r>
-      <w:r>
-        <w:t xml:space="preserve"> AI </w:t>
-      </w:r>
-      <w:r>
-        <w:rPr>
-          <w:rFonts w:hint="eastAsia"/>
-        </w:rPr>
-        <w:t xml:space="preserve">相关业务，尤其是</w:t>
-      </w:r>
-      <w:r>
-        <w:t xml:space="preserve"> AI </w:t>
-      </w:r>
-      <w:r>
-        <w:rPr>
-          <w:rFonts w:hint="eastAsia"/>
-        </w:rPr>
-        <w:t xml:space="preserve">代理机构和微</w:t>
-      </w:r>
-      <w:r>
-        <w:t xml:space="preserve"> SaaS </w:t>
-      </w:r>
-      <w:r>
-        <w:rPr>
-          <w:rFonts w:hint="eastAsia"/>
-        </w:rPr>
-        <w:t xml:space="preserve">产品的开发。</w:t>
-      </w:r>
-      <w:r>
-        <w:t xml:space="preserve"> </w:t>
-      </w:r>
-      <w:r>
-        <w:t xml:space="preserve">### </w:t>
-      </w:r>
-      <w:r>
-        <w:rPr>
-          <w:rFonts w:hint="eastAsia"/>
-        </w:rPr>
-        <w:t xml:space="preserve">（二）应用模式</w:t>
-      </w:r>
-      <w:r>
-        <w:t xml:space="preserve"> </w:t>
-      </w:r>
-      <w:r>
-        <w:t xml:space="preserve">AI </w:t>
-      </w:r>
-      <w:r>
-        <w:rPr>
-          <w:rFonts w:hint="eastAsia"/>
-        </w:rPr>
-        <w:t xml:space="preserve">应用逐渐深入各个行业，如医疗美容、房地产、金融等，为解决特定行业的问题提供了创新的解决方案。同时，注重客户体验和数据驱动的自动化流程成为应用开发的重要方向。</w:t>
-      </w:r>
-      <w:r>
-        <w:t xml:space="preserve"> </w:t>
-      </w:r>
-      <w:r>
-        <w:t xml:space="preserve">### </w:t>
-      </w:r>
-      <w:r>
-        <w:rPr>
-          <w:rFonts w:hint="eastAsia"/>
-        </w:rPr>
-        <w:t xml:space="preserve">（三）技术需求</w:t>
-      </w:r>
-      <w:r>
-        <w:t xml:space="preserve"> </w:t>
-      </w:r>
-      <w:r>
-        <w:rPr>
-          <w:rFonts w:hint="eastAsia"/>
-        </w:rPr>
-        <w:t xml:space="preserve">技术连接与集成的需求不断增加，社区成员在将不同的</w:t>
-      </w:r>
-      <w:r>
-        <w:t xml:space="preserve"> API </w:t>
-      </w:r>
-      <w:r>
-        <w:rPr>
-          <w:rFonts w:hint="eastAsia"/>
-        </w:rPr>
-        <w:t xml:space="preserve">和平台进行连接时遇到了各种问题，反映出对相关技术支持和教程的迫切需求。</w:t>
-      </w:r>
-      <w:r>
-        <w:t xml:space="preserve"> </w:t>
-      </w:r>
-      <w:r>
-        <w:t xml:space="preserve">### </w:t>
-      </w:r>
-      <w:r>
-        <w:rPr>
-          <w:rFonts w:hint="eastAsia"/>
-        </w:rPr>
-        <w:t xml:space="preserve">（四）销售策略转变</w:t>
-      </w:r>
-      <w:r>
-        <w:t xml:space="preserve"> </w:t>
-      </w:r>
-      <w:r>
-        <w:rPr>
-          <w:rFonts w:hint="eastAsia"/>
-        </w:rPr>
-        <w:t xml:space="preserve">随着</w:t>
-      </w:r>
-      <w:r>
-        <w:t xml:space="preserve"> AI </w:t>
-      </w:r>
-      <w:r>
-        <w:rPr>
-          <w:rFonts w:hint="eastAsia"/>
-        </w:rPr>
-        <w:t xml:space="preserve">市场的发展，B2B</w:t>
-      </w:r>
-      <w:r>
-        <w:t xml:space="preserve"> </w:t>
-      </w:r>
-      <w:r>
-        <w:rPr>
-          <w:rFonts w:hint="eastAsia"/>
-        </w:rPr>
-        <w:t xml:space="preserve">销售策略需要适应企业主的决策方式，从情感销售转向更注重实际价值和效益的销售方式。</w:t>
-      </w:r>
-      <w:r>
-        <w:t xml:space="preserve"> </w:t>
-      </w:r>
-      <w:r>
-        <w:t xml:space="preserve">### </w:t>
-      </w:r>
-      <w:r>
-        <w:rPr>
-          <w:rFonts w:hint="eastAsia"/>
-        </w:rPr>
-        <w:t xml:space="preserve">（五）学习与转型</w:t>
-      </w:r>
-      <w:r>
-        <w:t xml:space="preserve"> </w:t>
-      </w:r>
-      <w:r>
-        <w:rPr>
-          <w:rFonts w:hint="eastAsia"/>
-        </w:rPr>
-        <w:t xml:space="preserve">越来越多的人从传统行业转向</w:t>
-      </w:r>
-      <w:r>
-        <w:t xml:space="preserve"> AI </w:t>
-      </w:r>
-      <w:r>
-        <w:rPr>
-          <w:rFonts w:hint="eastAsia"/>
-        </w:rPr>
-        <w:t xml:space="preserve">领域，对学习和成长的需求增加，希望了解如何快速掌握技能并实现盈利。</w:t>
+        <w:t xml:space="preserve">AI系统构建课程</w:t>
+      </w:r>
+      <w:r>
+        <w:rPr>
+          <w:rFonts w:hint="eastAsia"/>
+        </w:rPr>
+        <w:t xml:space="preserve">：Aidan</w:t>
+      </w:r>
+      <w:r>
+        <w:t xml:space="preserve"> </w:t>
+      </w:r>
+      <w:r>
+        <w:rPr>
+          <w:rFonts w:hint="eastAsia"/>
+        </w:rPr>
+        <w:t xml:space="preserve">Finnegan分享了他近一个月来致力于推动各行业AI应用的成果——算法AI系统构建课程。该系统通过构建代表业务决策的方程，并设置关键AI代理作为“解释器”，用变量填充方程，让方程的输出代表企业做出决策。课程和他的社区都是免费的。</w:t>
       </w:r>
     </w:p>
     <w:bookmarkEnd w:id="14"/>
     <w:bookmarkEnd w:id="15"/>
-    <w:bookmarkStart w:id="17" w:name="五结论与展望"/>
+    <w:bookmarkStart w:id="19" w:name="趋势与模式分析"/>
     <w:p>
       <w:pPr>
         <w:pStyle w:val="Heading2"/>
@@ -1225,10 +556,10 @@
         <w:rPr>
           <w:rFonts w:hint="eastAsia"/>
         </w:rPr>
-        <w:t xml:space="preserve">五、结论与展望</w:t>
-      </w:r>
-    </w:p>
-    <w:bookmarkStart w:id="16" w:name="一结论"/>
+        <w:t xml:space="preserve">趋势与模式分析</w:t>
+      </w:r>
+    </w:p>
+    <w:bookmarkStart w:id="16" w:name="技术工具整合趋势"/>
     <w:p>
       <w:pPr>
         <w:pStyle w:val="Heading3"/>
@@ -1237,7 +568,7 @@
         <w:rPr>
           <w:rFonts w:hint="eastAsia"/>
         </w:rPr>
-        <w:t xml:space="preserve">（一）结论</w:t>
+        <w:t xml:space="preserve">技术工具整合趋势</w:t>
       </w:r>
     </w:p>
     <w:p>
@@ -1248,64 +579,209 @@
         <w:rPr>
           <w:rFonts w:hint="eastAsia"/>
         </w:rPr>
-        <w:t xml:space="preserve">通过对这些帖子的分析，可以看出</w:t>
-      </w:r>
-      <w:r>
-        <w:t xml:space="preserve"> AI </w:t>
-      </w:r>
-      <w:r>
-        <w:rPr>
-          <w:rFonts w:hint="eastAsia"/>
-        </w:rPr>
-        <w:t xml:space="preserve">自动化领域充满了机遇和挑战。创业合作、应用开发、技术连接、销售策略和学习成长是社区成员关注的主要方面。目前，AI</w:t>
-      </w:r>
-      <w:r>
-        <w:t xml:space="preserve"> </w:t>
-      </w:r>
-      <w:r>
-        <w:rPr>
-          <w:rFonts w:hint="eastAsia"/>
-        </w:rPr>
-        <w:t xml:space="preserve">应用在各个行业的渗透不断加深，但在技术实现和销售推广方面仍存在一些问题。</w:t>
-      </w:r>
-      <w:r>
-        <w:t xml:space="preserve"> </w:t>
-      </w:r>
-      <w:r>
-        <w:t xml:space="preserve">### </w:t>
-      </w:r>
-      <w:r>
-        <w:rPr>
-          <w:rFonts w:hint="eastAsia"/>
-        </w:rPr>
-        <w:t xml:space="preserve">（二）展望</w:t>
-      </w:r>
-      <w:r>
-        <w:t xml:space="preserve"> </w:t>
-      </w:r>
-      <w:r>
-        <w:rPr>
-          <w:rFonts w:hint="eastAsia"/>
-        </w:rPr>
-        <w:t xml:space="preserve">未来，随着</w:t>
-      </w:r>
-      <w:r>
-        <w:t xml:space="preserve"> AI </w:t>
-      </w:r>
-      <w:r>
-        <w:rPr>
-          <w:rFonts w:hint="eastAsia"/>
-        </w:rPr>
-        <w:t xml:space="preserve">技术的不断发展，预计会有更多创新的应用和商业模式出现。社区成员之间的合作将更加紧密，共同推动</w:t>
-      </w:r>
-      <w:r>
-        <w:t xml:space="preserve"> AI </w:t>
-      </w:r>
-      <w:r>
-        <w:rPr>
-          <w:rFonts w:hint="eastAsia"/>
-        </w:rPr>
-        <w:t xml:space="preserve">自动化领域的发展。同时，对技术支持和销售培训的需求也将促使相关服务的不断完善。建议社区成员加强交流与合作，分享经验和资源，共同应对挑战，抓住机遇，实现个人和行业的共同发展。</w:t>
+        <w:t xml:space="preserve">从帖子中可以看出，n8n在多个业务场景中得到了广泛应用，并且呈现出与其他工具整合的趋势。如Duy</w:t>
+      </w:r>
+      <w:r>
+        <w:t xml:space="preserve"> </w:t>
+      </w:r>
+      <w:r>
+        <w:rPr>
+          <w:rFonts w:hint="eastAsia"/>
+        </w:rPr>
+        <w:t xml:space="preserve">Bui将多个n8n模板整合为一个智能系统，Roland</w:t>
+      </w:r>
+      <w:r>
+        <w:t xml:space="preserve"> </w:t>
+      </w:r>
+      <w:r>
+        <w:rPr>
+          <w:rFonts w:hint="eastAsia"/>
+        </w:rPr>
+        <w:t xml:space="preserve">Jungenkrueger利用n8n完善Jotform的功能。这种整合能够提高工作效率，减少手动操作，降低错误率，未来可能会有更多的工具与n8n进行深度整合，以满足更复杂的业务需求。</w:t>
+      </w:r>
+    </w:p>
+    <w:bookmarkEnd w:id="16"/>
+    <w:bookmarkStart w:id="17" w:name="人工智能在细分领域的应用"/>
+    <w:p>
+      <w:pPr>
+        <w:pStyle w:val="Heading3"/>
+      </w:pPr>
+      <w:r>
+        <w:rPr>
+          <w:rFonts w:hint="eastAsia"/>
+        </w:rPr>
+        <w:t xml:space="preserve">人工智能在细分领域的应用</w:t>
+      </w:r>
+    </w:p>
+    <w:p>
+      <w:pPr>
+        <w:pStyle w:val="FirstParagraph"/>
+      </w:pPr>
+      <w:r>
+        <w:rPr>
+          <w:rFonts w:hint="eastAsia"/>
+        </w:rPr>
+        <w:t xml:space="preserve">人工智能在各个细分领域的应用越来越深入。例如Gian</w:t>
+      </w:r>
+      <w:r>
+        <w:t xml:space="preserve"> </w:t>
+      </w:r>
+      <w:r>
+        <w:rPr>
+          <w:rFonts w:hint="eastAsia"/>
+        </w:rPr>
+        <w:t xml:space="preserve">Gallegos针对菲律宾单身人士的财务需求开发了AI微SaaS产品，Aidan</w:t>
+      </w:r>
+      <w:r>
+        <w:t xml:space="preserve"> </w:t>
+      </w:r>
+      <w:r>
+        <w:rPr>
+          <w:rFonts w:hint="eastAsia"/>
+        </w:rPr>
+        <w:t xml:space="preserve">Finnegan构建了算法AI系统来解决企业决策问题。这表明人工智能不再局限于通用领域，而是朝着满足特定群体或特定业务需求的方向发展，未来可能会出现更多针对细分市场的AI创新产品。</w:t>
+      </w:r>
+    </w:p>
+    <w:bookmarkEnd w:id="17"/>
+    <w:bookmarkStart w:id="18" w:name="业务拓展注重个性化与风险控制"/>
+    <w:p>
+      <w:pPr>
+        <w:pStyle w:val="Heading3"/>
+      </w:pPr>
+      <w:r>
+        <w:rPr>
+          <w:rFonts w:hint="eastAsia"/>
+        </w:rPr>
+        <w:t xml:space="preserve">业务拓展注重个性化与风险控制</w:t>
+      </w:r>
+    </w:p>
+    <w:p>
+      <w:pPr>
+        <w:pStyle w:val="FirstParagraph"/>
+      </w:pPr>
+      <w:r>
+        <w:rPr>
+          <w:rFonts w:hint="eastAsia"/>
+        </w:rPr>
+        <w:t xml:space="preserve">在业务拓展方面，黑五活动策划的讨论体现了企业对营销创新的追求，而Guarracino</w:t>
+      </w:r>
+      <w:r>
+        <w:t xml:space="preserve"> </w:t>
+      </w:r>
+      <w:r>
+        <w:rPr>
+          <w:rFonts w:hint="eastAsia"/>
+        </w:rPr>
+        <w:t xml:space="preserve">Alessandro关于服务报价的困惑则反映出在吸引客户时，企业既要考虑收取足够的费用，又要降低客户的感知风险。这意味着未来企业在业务拓展过程中，需要更加注重个性化的服务和报价策略，以提高客户的接受度和忠诚度。</w:t>
+      </w:r>
+    </w:p>
+    <w:bookmarkEnd w:id="18"/>
+    <w:bookmarkEnd w:id="19"/>
+    <w:bookmarkStart w:id="22" w:name="结论与展望"/>
+    <w:p>
+      <w:pPr>
+        <w:pStyle w:val="Heading2"/>
+      </w:pPr>
+      <w:r>
+        <w:rPr>
+          <w:rFonts w:hint="eastAsia"/>
+        </w:rPr>
+        <w:t xml:space="preserve">结论与展望</w:t>
+      </w:r>
+    </w:p>
+    <w:bookmarkStart w:id="20" w:name="结论"/>
+    <w:p>
+      <w:pPr>
+        <w:pStyle w:val="Heading3"/>
+      </w:pPr>
+      <w:r>
+        <w:rPr>
+          <w:rFonts w:hint="eastAsia"/>
+        </w:rPr>
+        <w:t xml:space="preserve">结论</w:t>
+      </w:r>
+    </w:p>
+    <w:p>
+      <w:pPr>
+        <w:pStyle w:val="FirstParagraph"/>
+      </w:pPr>
+      <w:r>
+        <w:rPr>
+          <w:rFonts w:hint="eastAsia"/>
+        </w:rPr>
+        <w:t xml:space="preserve">通过对这些帖子的分析，可以得出以下结论：</w:t>
+      </w:r>
+      <w:r>
+        <w:t xml:space="preserve"> </w:t>
+      </w:r>
+      <w:r>
+        <w:t xml:space="preserve">1. </w:t>
+      </w:r>
+      <w:r>
+        <w:rPr>
+          <w:rFonts w:hint="eastAsia"/>
+        </w:rPr>
+        <w:t xml:space="preserve">求职技巧对于求职者来说至关重要，合理的简历制作和求职策略能够提高获得工作的机会。</w:t>
+      </w:r>
+      <w:r>
+        <w:t xml:space="preserve"> </w:t>
+      </w:r>
+      <w:r>
+        <w:t xml:space="preserve">2. </w:t>
+      </w:r>
+      <w:r>
+        <w:rPr>
+          <w:rFonts w:hint="eastAsia"/>
+        </w:rPr>
+        <w:t xml:space="preserve">技术工具的整合和创新应用能够显著提高工作效率和业务质量，n8n在这方面具有很大的潜力。</w:t>
+      </w:r>
+      <w:r>
+        <w:t xml:space="preserve"> </w:t>
+      </w:r>
+      <w:r>
+        <w:t xml:space="preserve">3. </w:t>
+      </w:r>
+      <w:r>
+        <w:rPr>
+          <w:rFonts w:hint="eastAsia"/>
+        </w:rPr>
+        <w:t xml:space="preserve">人工智能在细分领域的应用将为企业带来新的商机和竞争优势。</w:t>
+      </w:r>
+      <w:r>
+        <w:t xml:space="preserve"> </w:t>
+      </w:r>
+      <w:r>
+        <w:t xml:space="preserve">4. </w:t>
+      </w:r>
+      <w:r>
+        <w:rPr>
+          <w:rFonts w:hint="eastAsia"/>
+        </w:rPr>
+        <w:t xml:space="preserve">业务拓展需要注重个性化和风险控制，以适应市场的变化和客户的需求。</w:t>
+      </w:r>
+    </w:p>
+    <w:bookmarkEnd w:id="20"/>
+    <w:bookmarkStart w:id="21" w:name="展望"/>
+    <w:p>
+      <w:pPr>
+        <w:pStyle w:val="Heading3"/>
+      </w:pPr>
+      <w:r>
+        <w:rPr>
+          <w:rFonts w:hint="eastAsia"/>
+        </w:rPr>
+        <w:t xml:space="preserve">展望</w:t>
+      </w:r>
+    </w:p>
+    <w:p>
+      <w:pPr>
+        <w:pStyle w:val="FirstParagraph"/>
+      </w:pPr>
+      <w:r>
+        <w:rPr>
+          <w:rFonts w:hint="eastAsia"/>
+        </w:rPr>
+        <w:t xml:space="preserve">未来，随着技术的不断发展，n8n等工具可能会与更多的软件和平台进行整合，形成更加完善的工作流程。人工智能在各个领域的应用将更加广泛和深入，为企业和个人带来更多的便利和价值。在业务拓展方面，企业需要不断创新营销方式，提供更加个性化的服务和产品，以应对日益激烈的市场竞争。同时，求职者也需要不断提升自己的技能和竞争力，以适应不断变化的就业市场。</w:t>
       </w:r>
     </w:p>
     <w:p>
@@ -1351,7 +827,7 @@
           <w:rStyle w:val="VerbatimChar"/>
           <w:rFonts w:hint="eastAsia"/>
         </w:rPr>
-        <w:t xml:space="preserve">帖子数量：14</w:t>
+        <w:t xml:space="preserve">帖子数量：15</w:t>
       </w:r>
       <w:r>
         <w:br/>
@@ -1386,8 +862,8 @@
         <w:t xml:space="preserve">模型：doubao-1-5-pro-32k-250115</w:t>
       </w:r>
     </w:p>
-    <w:bookmarkEnd w:id="16"/>
-    <w:bookmarkEnd w:id="17"/>
+    <w:bookmarkEnd w:id="21"/>
+    <w:bookmarkEnd w:id="22"/>
     <w:sectPr>
       <w:footnotePr>
         <w:numRestart w:val="eachSect"/>
@@ -1498,123 +974,120 @@
       </w:pPr>
     </w:lvl>
   </w:abstractNum>
-  <w:abstractNum w:abstractNumId="99411">
-    <w:nsid w:val="00A99411"/>
+  <w:abstractNum w:abstractNumId="991">
+    <w:nsid w:val="0000A991"/>
     <w:multiLevelType w:val="multilevel"/>
     <w:lvl w:ilvl="0">
-      <w:start w:val="1"/>
-      <w:numFmt w:val="decimal"/>
-      <w:lvlText w:val="%1."/>
+      <w:numFmt w:val="bullet"/>
+      <w:lvlText w:val=""/>
       <w:lvlJc w:val="left"/>
       <w:pPr>
         <w:ind w:left="720" w:hanging="360"/>
       </w:pPr>
+      <w:rPr>
+        <w:rFonts w:ascii="Symbol" w:hAnsi="Symbol" w:cs="Symbol" w:hint="default"/>
+      </w:rPr>
     </w:lvl>
     <w:lvl w:ilvl="1">
-      <w:start w:val="1"/>
-      <w:numFmt w:val="decimal"/>
-      <w:lvlText w:val="%2."/>
+      <w:numFmt w:val="bullet"/>
+      <w:lvlText w:val="o"/>
       <w:lvlJc w:val="left"/>
       <w:pPr>
         <w:ind w:left="1440" w:hanging="360"/>
       </w:pPr>
+      <w:rPr>
+        <w:rFonts w:ascii="Courier New" w:hAnsi="Courier New" w:cs="Courier New" w:hint="default"/>
+      </w:rPr>
     </w:lvl>
     <w:lvl w:ilvl="2">
-      <w:start w:val="1"/>
-      <w:numFmt w:val="decimal"/>
-      <w:lvlText w:val="%3."/>
+      <w:numFmt w:val="bullet"/>
+      <w:lvlText w:val=""/>
       <w:lvlJc w:val="left"/>
       <w:pPr>
         <w:ind w:left="2160" w:hanging="360"/>
       </w:pPr>
+      <w:rPr>
+        <w:rFonts w:ascii="Wingdings" w:hAnsi="Wingdings" w:cs="Wingdings" w:hint="default"/>
+      </w:rPr>
     </w:lvl>
     <w:lvl w:ilvl="3">
-      <w:start w:val="1"/>
-      <w:numFmt w:val="decimal"/>
-      <w:lvlText w:val="%4."/>
+      <w:numFmt w:val="bullet"/>
+      <w:lvlText w:val=""/>
       <w:lvlJc w:val="left"/>
       <w:pPr>
         <w:ind w:left="2880" w:hanging="360"/>
       </w:pPr>
+      <w:rPr>
+        <w:rFonts w:ascii="Symbol" w:hAnsi="Symbol" w:cs="Symbol" w:hint="default"/>
+      </w:rPr>
     </w:lvl>
     <w:lvl w:ilvl="4">
-      <w:start w:val="1"/>
-      <w:numFmt w:val="decimal"/>
-      <w:lvlText w:val="%5."/>
+      <w:numFmt w:val="bullet"/>
+      <w:lvlText w:val="o"/>
       <w:lvlJc w:val="left"/>
       <w:pPr>
         <w:ind w:left="3600" w:hanging="360"/>
       </w:pPr>
+      <w:rPr>
+        <w:rFonts w:ascii="Courier New" w:hAnsi="Courier New" w:cs="Courier New" w:hint="default"/>
+      </w:rPr>
     </w:lvl>
     <w:lvl w:ilvl="5">
-      <w:start w:val="1"/>
-      <w:numFmt w:val="decimal"/>
-      <w:lvlText w:val="%6."/>
+      <w:numFmt w:val="bullet"/>
+      <w:lvlText w:val=""/>
       <w:lvlJc w:val="left"/>
       <w:pPr>
         <w:ind w:left="4320" w:hanging="360"/>
       </w:pPr>
+      <w:rPr>
+        <w:rFonts w:ascii="Wingdings" w:hAnsi="Wingdings" w:cs="Wingdings" w:hint="default"/>
+      </w:rPr>
     </w:lvl>
     <w:lvl w:ilvl="6">
-      <w:start w:val="1"/>
-      <w:numFmt w:val="decimal"/>
-      <w:lvlText w:val="%7."/>
+      <w:numFmt w:val="bullet"/>
+      <w:lvlText w:val=""/>
       <w:lvlJc w:val="left"/>
       <w:pPr>
         <w:ind w:left="5040" w:hanging="360"/>
       </w:pPr>
+      <w:rPr>
+        <w:rFonts w:ascii="Symbol" w:hAnsi="Symbol" w:cs="Symbol" w:hint="default"/>
+      </w:rPr>
     </w:lvl>
     <w:lvl w:ilvl="7">
-      <w:start w:val="1"/>
-      <w:numFmt w:val="decimal"/>
-      <w:lvlText w:val="%8."/>
+      <w:numFmt w:val="bullet"/>
+      <w:lvlText w:val="o"/>
       <w:lvlJc w:val="left"/>
       <w:pPr>
         <w:ind w:left="5760" w:hanging="360"/>
       </w:pPr>
+      <w:rPr>
+        <w:rFonts w:ascii="Courier New" w:hAnsi="Courier New" w:cs="Courier New" w:hint="default"/>
+      </w:rPr>
     </w:lvl>
     <w:lvl w:ilvl="8">
-      <w:start w:val="1"/>
-      <w:numFmt w:val="decimal"/>
-      <w:lvlText w:val="%9."/>
+      <w:numFmt w:val="bullet"/>
+      <w:lvlText w:val=""/>
       <w:lvlJc w:val="left"/>
       <w:pPr>
         <w:ind w:left="6480" w:hanging="360"/>
       </w:pPr>
+      <w:rPr>
+        <w:rFonts w:ascii="Wingdings" w:hAnsi="Wingdings" w:cs="Wingdings" w:hint="default"/>
+      </w:rPr>
     </w:lvl>
   </w:abstractNum>
   <w:num w:numId="1000">
     <w:abstractNumId w:val="990"/>
   </w:num>
   <w:num w:numId="1001">
-    <w:abstractNumId w:val="99411"/>
-    <w:lvlOverride w:ilvl="0">
-      <w:startOverride w:val="1"/>
-    </w:lvlOverride>
-    <w:lvlOverride w:ilvl="1">
-      <w:startOverride w:val="1"/>
-    </w:lvlOverride>
-    <w:lvlOverride w:ilvl="2">
-      <w:startOverride w:val="1"/>
-    </w:lvlOverride>
-    <w:lvlOverride w:ilvl="3">
-      <w:startOverride w:val="1"/>
-    </w:lvlOverride>
-    <w:lvlOverride w:ilvl="4">
-      <w:startOverride w:val="1"/>
-    </w:lvlOverride>
-    <w:lvlOverride w:ilvl="5">
-      <w:startOverride w:val="1"/>
-    </w:lvlOverride>
-    <w:lvlOverride w:ilvl="6">
-      <w:startOverride w:val="1"/>
-    </w:lvlOverride>
-    <w:lvlOverride w:ilvl="7">
-      <w:startOverride w:val="1"/>
-    </w:lvlOverride>
-    <w:lvlOverride w:ilvl="8">
-      <w:startOverride w:val="1"/>
-    </w:lvlOverride>
+    <w:abstractNumId w:val="991"/>
+  </w:num>
+  <w:num w:numId="1002">
+    <w:abstractNumId w:val="991"/>
+  </w:num>
+  <w:num w:numId="1003">
+    <w:abstractNumId w:val="991"/>
   </w:num>
 </w:numbering>
 </file>

</xml_diff>